<commit_message>
updated tehe index to have the current manuscript text
</commit_message>
<xml_diff>
--- a/docs/index.docx
+++ b/docs/index.docx
@@ -7,7 +7,7 @@
         <w:pStyle w:val="Title"/>
       </w:pPr>
       <w:r>
-        <w:t xml:space="preserve">Fear alone influences the behaviour of a keystone native prey by an invader; a non-consumptive effect of the catfish invasion of Aotearoa New Zealand’s freshwaters</w:t>
+        <w:t xml:space="preserve">Fear of the invader: a predatory invader may provoke stronger non-consumptive effects on a keystone native prey than a co-evolved native predator</w:t>
       </w:r>
     </w:p>
     <w:p>
@@ -71,7 +71,7 @@
         <w:pStyle w:val="Date"/>
       </w:pPr>
       <w:r>
-        <w:t xml:space="preserve">2026-03-30</w:t>
+        <w:t xml:space="preserve">2026-04-17</w:t>
       </w:r>
     </w:p>
     <w:p>
@@ -87,31 +87,7 @@
         <w:pStyle w:val="Abstract"/>
       </w:pPr>
       <w:r>
-        <w:t xml:space="preserve">Non-consumptive effects (NCEs) or</w:t>
-      </w:r>
-      <w:r>
-        <w:t xml:space="preserve"> </w:t>
-      </w:r>
-      <w:r>
-        <w:t xml:space="preserve">‘fear’</w:t>
-      </w:r>
-      <w:r>
-        <w:t xml:space="preserve"> </w:t>
-      </w:r>
-      <w:r>
-        <w:t xml:space="preserve">responses to predators encompass costly antipredator behaviours, such as increasing refuge use in conjunction with decreasing foraging and feeding efficiency. Such NCEs could influence prey population dynamics and even community structure and function, if the prey themselves are</w:t>
-      </w:r>
-      <w:r>
-        <w:t xml:space="preserve"> </w:t>
-      </w:r>
-      <w:r>
-        <w:t xml:space="preserve">‘keystone’</w:t>
-      </w:r>
-      <w:r>
-        <w:t xml:space="preserve"> </w:t>
-      </w:r>
-      <w:r>
-        <w:t xml:space="preserve">species. In Aotearoa-New Zealand, the native freshwater crayfish kōura (</w:t>
+        <w:t xml:space="preserve">Non-consumptive effects (NCEs) of predators on prey encompass costly antipredator behaviours such as increased refuge use and reduced foraging, which can influence prey population dynamics and community structure, particularly when the prey themselves are keystone species. In Aotearoa-New Zealand, the native freshwater crayfish kōura (</w:t>
       </w:r>
       <w:r>
         <w:rPr>
@@ -121,7 +97,7 @@
         <w:t xml:space="preserve">Paranephrops planifrons</w:t>
       </w:r>
       <w:r>
-        <w:t xml:space="preserve">) is a keystone species and an ecosystem engineer but is preyed upon by native longfin eels (</w:t>
+        <w:t xml:space="preserve">) is a keystone species, an ecosystem engineer with a critical functional role in sediment dynamics, nutrient cycling and benthic community structure. Kōura are preyed upon by both the co-evolved native longfin eel (</w:t>
       </w:r>
       <w:r>
         <w:rPr>
@@ -141,10 +117,10 @@
         <w:t xml:space="preserve">Ameiurus nebulosus</w:t>
       </w:r>
       <w:r>
-        <w:t xml:space="preserve">). Using controlled aquarium experiments, we tested whether visual and chemical cues from each predator induced changes in kōura refuge-seeking and feeding behaviour. Neither predator treatment significantly affected refuge use or feeding rate. The absence of a significant response to either predator, including the co-evolved eel, may reflect limited prior predator experience in the source lakes where eel densities are low. Substantial individual variation in kōura behaviour further reduced statistical power to detect treatment effects, highlighting the importance of accounting for personality differences in future NCE studies.</w:t>
-      </w:r>
-    </w:p>
-    <w:bookmarkStart w:id="20" w:name="introduction"/>
+        <w:t xml:space="preserve">), a species introduced less than two centuries ago. Under laboratory conditions, we tested whether visual and chemical cues from the two predators induced different changes in kōura refuge-seeking and feeding behaviour. In a mesocosm habitat experiment, predator presence produced a NCE on refuge use, with kōura exposed to catfish cues showing significantly greater refuge-seeking behaviour than those exposed to eel cues. This is consistent with a generalised overcautious fear response triggered by unfamiliar predator cues rather than classic prey naivety. Neither predator treatment differed significantly from the control, however the catfish–eel contrast was robust and biologically meaningful. In the kōura feeding experiment, exposure to catfish and eel kairomones had no clear effect on feeding rate. Our study indicates catfish incursions may provoke a greater NCE on kōura refuge use than resident eels. As catfish range expansion continues, these NCEs represent an ecologically significant and underappreciated threat to kōura populations, compounding the direct predation pressure already documented for this invader.</w:t>
+      </w:r>
+    </w:p>
+    <w:bookmarkStart w:id="9" w:name="introduction"/>
     <w:p>
       <w:pPr>
         <w:pStyle w:val="Heading1"/>
@@ -158,7 +134,52 @@
         <w:pStyle w:val="FirstParagraph"/>
       </w:pPr>
       <w:r>
-        <w:t xml:space="preserve">Biological invasions can have profound impacts on invaded ecosystems, particularly through the introduction of novel predators that prey upon native species lacking an evolutionary history with them (Doherty et al., 2016). Native prey are often naïve to these predators, making them especially vulnerable to direct predation (Gamradt &amp; Kats, 1996; Smith et al., 2008). In addition to these consumptive effects (CEs), native prey may exhibit heightened fear responses to invasive predators, leading to the development of anti-predator behaviours such as increased refuge use and avoidance of open habitats (Kindlinger &amp; Albins, 2017). These behavioural changes, termed non-consumptive effects (NCEs), can substantially influence population dynamics by reducing foraging activity, growth, and reproductive output (Pressier et al., 2005). In contrast, native predators generally elicit different responses because prey and predators have co-evolved, resulting in behavioural and physiological adaptations that stabilise predator–prey interactions within local ecosystems (Abrams, 2000).</w:t>
+        <w:t xml:space="preserve">Biological invasions can have profound impacts on invaded ecosystems, particularly through the introduction of novel predators that prey upon native species lacking an evolutionary history with them</w:t>
+      </w:r>
+      <w:r>
+        <w:t xml:space="preserve"> </w:t>
+      </w:r>
+      <w:r>
+        <w:t xml:space="preserve">(Doherty et al., 2016)</w:t>
+      </w:r>
+      <w:r>
+        <w:t xml:space="preserve">. Native prey are often naïve to these predators, making them especially vulnerable to direct predation</w:t>
+      </w:r>
+      <w:r>
+        <w:t xml:space="preserve"> </w:t>
+      </w:r>
+      <w:r>
+        <w:t xml:space="preserve">(Gamradt &amp; Kats, 1996; Smith et al., 2008)</w:t>
+      </w:r>
+      <w:r>
+        <w:t xml:space="preserve">. In addition to these consumptive effects, native prey may exhibit heightened fear responses to invasive predators, leading to the development of anti-predator behaviours such as increased refuge use and avoidance of open habitats</w:t>
+      </w:r>
+      <w:r>
+        <w:t xml:space="preserve"> </w:t>
+      </w:r>
+      <w:r>
+        <w:t xml:space="preserve">(Kindinger &amp; Albins, 2017)</w:t>
+      </w:r>
+      <w:r>
+        <w:t xml:space="preserve">. These behavioural changes, termed non-consumptive effects (NCEs), can substantially influence population dynamics by reducing foraging activity, growth, and reproductive output</w:t>
+      </w:r>
+      <w:r>
+        <w:t xml:space="preserve"> </w:t>
+      </w:r>
+      <w:r>
+        <w:t xml:space="preserve">(Preisser et al., 2005)</w:t>
+      </w:r>
+      <w:r>
+        <w:t xml:space="preserve">. In contrast, native predators generally elicit different responses because prey and predators have co-evolved, resulting in behavioural and physiological adaptations that stabilise predator–prey interactions within local ecosystems</w:t>
+      </w:r>
+      <w:r>
+        <w:t xml:space="preserve"> </w:t>
+      </w:r>
+      <w:r>
+        <w:t xml:space="preserve">(Abrams, 2000)</w:t>
+      </w:r>
+      <w:r>
+        <w:t xml:space="preserve">.</w:t>
       </w:r>
     </w:p>
     <w:p>
@@ -166,7 +187,52 @@
         <w:pStyle w:val="BodyText"/>
       </w:pPr>
       <w:r>
-        <w:t xml:space="preserve">Freshwater crayfish rely primarily on chemical cues (kairomones) rather than visual cues to detect and respond to predatory fish (Blake &amp; Hart, 1993; Brönmark &amp; Hansson, 2012). The kairomones carry signals via excreta, mucus, or skin, that crayfish use to assess predator risk, responding more strongly to predators that have consumed conspecifics and to alarm cues released when prey are injured or killed (Gherardi et al., 2011; Beattie &amp; Moore, 2018). Exposure to kairomones from predatory fish can generate NCEs, including reduced growth and reduced activity levels in crayfish (Adams, 2007; Ramberg-Pihl &amp; Yurewicz, 2020), and even non-predatory fish can cause these behaviour changes, likely through heightened generalised awareness of risk (Nyström, 2005). However, the strength of these responses depends on prior experience as wild-caught individual crayfish show stronger antipredator responses than farmed conspecifics naive to predators (Martin, 2014), indicating that both individual experiences and evolutionary history shape kairomones detection.</w:t>
+        <w:t xml:space="preserve">Freshwater crayfish often live in turbid flowing water or in the dark depths of lakes, therefore they often rely primarily on chemical cues (kairomones) rather than visual cues to detect and respond to predatory fish</w:t>
+      </w:r>
+      <w:r>
+        <w:t xml:space="preserve"> </w:t>
+      </w:r>
+      <w:r>
+        <w:t xml:space="preserve">(BLAKE &amp; HART, 1993; Brönmark &amp; Hansson, 2012; Wood &amp; Moore, 2020b)</w:t>
+      </w:r>
+      <w:r>
+        <w:t xml:space="preserve">. The kairomones carry signals via excreta, mucus, or skin, that crayfish use to assess predator risk, responding more strongly to predators that have consumed conspecifics and to alarm cues released when prey are injured or killed</w:t>
+      </w:r>
+      <w:r>
+        <w:t xml:space="preserve"> </w:t>
+      </w:r>
+      <w:r>
+        <w:t xml:space="preserve">(Beattie &amp; Moore, 2018; Gherardi et al., 2011)</w:t>
+      </w:r>
+      <w:r>
+        <w:t xml:space="preserve">. Exposure to kairomones from predatory fish can generate NCEs, including reduced growth and reduced activity levels in crayfish</w:t>
+      </w:r>
+      <w:r>
+        <w:t xml:space="preserve"> </w:t>
+      </w:r>
+      <w:r>
+        <w:t xml:space="preserve">(ADAMS, 2007; Ramberg-Pihl &amp; Yurewicz, 2020)</w:t>
+      </w:r>
+      <w:r>
+        <w:t xml:space="preserve">, and even non-predatory fish can cause these behaviour changes, likely through heightened generalised awareness of risk</w:t>
+      </w:r>
+      <w:r>
+        <w:t xml:space="preserve"> </w:t>
+      </w:r>
+      <w:r>
+        <w:t xml:space="preserve">(Nyström, 2005)</w:t>
+      </w:r>
+      <w:r>
+        <w:t xml:space="preserve">. However, the strength of these responses depends on prior experience as wild-caught individual crayfish show stronger antipredator responses than farmed conspecifics naive to predators</w:t>
+      </w:r>
+      <w:r>
+        <w:t xml:space="preserve"> </w:t>
+      </w:r>
+      <w:r>
+        <w:t xml:space="preserve">(Martin, 2014)</w:t>
+      </w:r>
+      <w:r>
+        <w:t xml:space="preserve">, indicating that both individual experiences and evolutionary history shape kairomone detection.</w:t>
       </w:r>
     </w:p>
     <w:p>
@@ -190,19 +256,25 @@
         <w:t xml:space="preserve"> </w:t>
       </w:r>
       <w:r>
-        <w:t xml:space="preserve">White, 1842 commonly known as kōura is a</w:t>
-      </w:r>
-      <w:r>
-        <w:t xml:space="preserve"> </w:t>
-      </w:r>
-      <w:r>
-        <w:t xml:space="preserve">‘culturally treasured’</w:t>
-      </w:r>
-      <w:r>
-        <w:t xml:space="preserve"> </w:t>
-      </w:r>
-      <w:r>
-        <w:t xml:space="preserve">taonga species and valued food resource for Māori the indigenous people of Aotearoa (Kusabs &amp; Quinn, 2009). Ecologically, kōura play a critical role in freshwater ecosystems as ecosystem engineers through their effects on sediment dynamics, nutrient cycling, and benthic community structure, and have been described as keystone species in many freshwater systems (Collier at al., 1997; Parkyn et al., 2001; Usio &amp; Townsend, 2004). Kōura have a long co-evolutionary history with the native longfin eel (</w:t>
+        <w:t xml:space="preserve">White, 1842 commonly known as kōura is a ‘culturally treasured’ taonga species and a valued food resource for Māori the indigenous people of Aotearoa</w:t>
+      </w:r>
+      <w:r>
+        <w:t xml:space="preserve"> </w:t>
+      </w:r>
+      <w:r>
+        <w:t xml:space="preserve">(Kusabs &amp; Quinn, 2009)</w:t>
+      </w:r>
+      <w:r>
+        <w:t xml:space="preserve">. Ecologically, kōura play a critical role in freshwater ecosystems as ecosystem engineers through their effects on sediment dynamics, nutrient cycling, and benthic community structure, and have been described as keystone species in many freshwater systems</w:t>
+      </w:r>
+      <w:r>
+        <w:t xml:space="preserve"> </w:t>
+      </w:r>
+      <w:r>
+        <w:t xml:space="preserve">(Collier et al., 1997; Parkyn et al., 2001; Usio &amp; Townsend, 2004)</w:t>
+      </w:r>
+      <w:r>
+        <w:t xml:space="preserve">. Kōura have a long co-evolutionary history with the native longfin eel (</w:t>
       </w:r>
       <w:r>
         <w:rPr>
@@ -212,7 +284,7 @@
         <w:t xml:space="preserve">Anguilla dieffenbachii</w:t>
       </w:r>
       <w:r>
-        <w:t xml:space="preserve">) and shortfin eel (</w:t>
+        <w:t xml:space="preserve">) (hereafter eel) and shortfin eel (</w:t>
       </w:r>
       <w:r>
         <w:rPr>
@@ -222,7 +294,19 @@
         <w:t xml:space="preserve">A. australis</w:t>
       </w:r>
       <w:r>
-        <w:t xml:space="preserve">) (MacNeil et al., 2025) and have been shown to respond more strongly to eel kairomones than to those of introduced non-native brown trout (</w:t>
+        <w:t xml:space="preserve">)</w:t>
+      </w:r>
+      <w:r>
+        <w:t xml:space="preserve"> </w:t>
+      </w:r>
+      <w:r>
+        <w:t xml:space="preserve">(L. A. Brown, 2009; MacNeil et al., 2025)</w:t>
+      </w:r>
+      <w:r>
+        <w:t xml:space="preserve"> </w:t>
+      </w:r>
+      <w:r>
+        <w:t xml:space="preserve">and have been shown to respond more strongly to eel kairomones than to those of introduced non-native brown trout (</w:t>
       </w:r>
       <w:r>
         <w:rPr>
@@ -232,7 +316,25 @@
         <w:t xml:space="preserve">Salmo trutta</w:t>
       </w:r>
       <w:r>
-        <w:t xml:space="preserve">), even when sourced from streams where trout are present (Shave et al., 1994). This suggests that co-evolutionary history, rather than individual experience alone, shapes kōura predator recognition (Shave et al., 1994). Currently kōura are threatened by multiple interacting stressors, including climate change, water-quality degradation and invasive species, contributing to widespread population declines (Lee et al., 2025; Kusabs et al., in revision). One of the invasive species that threatens the kōura is the non-native brown bullhead catfish (</w:t>
+        <w:t xml:space="preserve">). This was even when kōura were sourced from streams where both eel and trout predators were present, suggesting that co-evolutionary history, rather than individual experience alone, shaped kōura predator recognition</w:t>
+      </w:r>
+      <w:r>
+        <w:t xml:space="preserve"> </w:t>
+      </w:r>
+      <w:r>
+        <w:t xml:space="preserve">(Shave et al., 1994)</w:t>
+      </w:r>
+      <w:r>
+        <w:t xml:space="preserve">. Currently kōura are threatened by multiple interacting stressors, including climate change, water-quality degradation and invasive species, contributing to widespread population declines</w:t>
+      </w:r>
+      <w:r>
+        <w:t xml:space="preserve"> </w:t>
+      </w:r>
+      <w:r>
+        <w:t xml:space="preserve">(Kusabs et al., n.d.; Lee et al., 2025)</w:t>
+      </w:r>
+      <w:r>
+        <w:t xml:space="preserve">. One of the invasive species that threatens kōura is the non-native brown bullhead catfish (</w:t>
       </w:r>
       <w:r>
         <w:rPr>
@@ -242,7 +344,37 @@
         <w:t xml:space="preserve">Ameiurus nebulosus</w:t>
       </w:r>
       <w:r>
-        <w:t xml:space="preserve">; Barnes &amp; Hicks, 2003; Dedual, 2019), which has been introduced in Aotearoa in 1878 and has spread over various waterways on the North Island (McDowall, 1990; Lee et al., 2025). The brown bullhead catfish is highly tolerant of a wide range of environmental conditions (Lee et al., 2025) and, due to its broad gape and opportunistic feeding behaviour, is capable of consuming a wide variety of native aquatic organisms (Scott &amp; Crossman, 1973; Dedual, 2019). The recent and ongoing spread of brown bullhead catfish into North Island waterways therefore represents a novel predation threat to which kōura may lack adequate behavioural or sensory adaptations.</w:t>
+        <w:t xml:space="preserve">) (hereafter catfish) which was introduced to Aotearoa in 1878 and has since spread through various waterways on the North Island</w:t>
+      </w:r>
+      <w:r>
+        <w:t xml:space="preserve"> </w:t>
+      </w:r>
+      <w:r>
+        <w:t xml:space="preserve">(Barnes &amp; Hicks, 2003; Dedual, 2019; Lee et al., 2025; McDowall, 1990)</w:t>
+      </w:r>
+      <w:r>
+        <w:t xml:space="preserve">. The brown bullhead catfish is highly tolerant of a wide range of environmental conditions</w:t>
+      </w:r>
+      <w:r>
+        <w:t xml:space="preserve"> </w:t>
+      </w:r>
+      <w:r>
+        <w:t xml:space="preserve">(Lee et al., 2025; Scott &amp; Crossman, 1973)</w:t>
+      </w:r>
+      <w:r>
+        <w:t xml:space="preserve"> </w:t>
+      </w:r>
+      <w:r>
+        <w:t xml:space="preserve">and, due to its broad gape and opportunistic feeding behaviour, is capable of consuming a wide variety of native aquatic organisms</w:t>
+      </w:r>
+      <w:r>
+        <w:t xml:space="preserve"> </w:t>
+      </w:r>
+      <w:r>
+        <w:t xml:space="preserve">(Dedual, 2019; Scott &amp; Crossman, 1973)</w:t>
+      </w:r>
+      <w:r>
+        <w:t xml:space="preserve">. The recent and ongoing spread of brown bullhead catfish into North Island waterways therefore represents a novel predation threat to which kōura may lack adequate behavioural or sensory adaptations.</w:t>
       </w:r>
     </w:p>
     <w:p>
@@ -250,11 +382,38 @@
         <w:pStyle w:val="BodyText"/>
       </w:pPr>
       <w:r>
-        <w:t xml:space="preserve">In this study, controlled aquarium experiments were used to test whether predator presence and associated chemical cues induce changes in refuge-seeking and feeding behaviour, providing insight into the behavioural mechanisms underlying NCEs of kōura responses to native and invasive predation threats. It is expected that kōura would show more shelter-seeking behaviour when presented with eels compared to catfish, due to naivety of the kōura towards catfish. Also, it is expected that light regime would have an influence on shelter seeking behaviour of this nocturnal species. For feeding behaviour it is expected that kōura will feed less when exposed to eel kairomones but as they will be naïve to catfish kairomones, feeding will be similar to the control. The findings of this study contribute to understanding the behavioural mechanisms underlying kōura vulnerability to invasive catfish and provide a basis for predicting population-level impacts as catfish continue to spread into uninvaded waterways across Aotearoa.</w:t>
-      </w:r>
-    </w:p>
-    <w:bookmarkEnd w:id="20"/>
-    <w:bookmarkStart w:id="25" w:name="materials-and-methods"/>
+        <w:t xml:space="preserve">In this study, controlled laboratory experiments were used to test whether predator presence and associated chemical cues induced changes in refuge-seeking and feeding behaviour, thereby providing insight into the behavioural mechanisms underlying NCEs of kōura responses to native and invasive predation threats. It is expected that kōura would show more shelter-seeking behaviour when presented with eels compared to catfish, due to naivety of the kōura towards a novel predator such as catfish</w:t>
+      </w:r>
+      <w:r>
+        <w:t xml:space="preserve"> </w:t>
+      </w:r>
+      <w:r>
+        <w:t xml:space="preserve">(Carthey &amp; Banks, 2014)</w:t>
+      </w:r>
+      <w:r>
+        <w:t xml:space="preserve">. However, an alternative prediction, consistent with fear generalisation theory, is that kōura may instead exhibit a heightened, overcautious response to the unfamiliar catfish cues, overresponding relative to the actual predation risk</w:t>
+      </w:r>
+      <w:r>
+        <w:t xml:space="preserve"> </w:t>
+      </w:r>
+      <w:r>
+        <w:t xml:space="preserve">(Sih et al., 2023)</w:t>
+      </w:r>
+      <w:r>
+        <w:t xml:space="preserve">. These two hypotheses generate opposite predictions, and the present study was designed to test which better describes kōura behavioural responses to native and invasive predator cues. Further, it is expected that light regime would have an influence on shelter seeking behaviour of kōura, which like many crayfish, are most active nocturnally</w:t>
+      </w:r>
+      <w:r>
+        <w:t xml:space="preserve"> </w:t>
+      </w:r>
+      <w:r>
+        <w:t xml:space="preserve">(Devcich, 1979; Johnson et al., 2014)</w:t>
+      </w:r>
+      <w:r>
+        <w:t xml:space="preserve">. It was also predicted that kōura feeding would be more inhibited when exposed to eel kairomones than to those of the novel catfish, reflecting the same co-evolutionary recognition expected to drive greater refuge use in response to eels. The overall aim of the refuge and feeding behaviour studies are to contribute to understanding the behavioural mechanisms underlying kōura vulnerability to invasive catfish and how these may differ from and be additional to, those already manifested in the presence of native predators such as eels.</w:t>
+      </w:r>
+    </w:p>
+    <w:bookmarkEnd w:id="9"/>
+    <w:bookmarkStart w:id="13" w:name="materials-and-methods"/>
     <w:p>
       <w:pPr>
         <w:pStyle w:val="Heading1"/>
@@ -263,7 +422,7 @@
         <w:t xml:space="preserve">Materials and Methods</w:t>
       </w:r>
     </w:p>
-    <w:bookmarkStart w:id="21" w:name="animal-collection-and-preparation"/>
+    <w:bookmarkStart w:id="10" w:name="animal-collection-and-preparation"/>
     <w:p>
       <w:pPr>
         <w:pStyle w:val="Heading2"/>
@@ -277,7 +436,46 @@
         <w:pStyle w:val="FirstParagraph"/>
       </w:pPr>
       <w:r>
-        <w:t xml:space="preserve">On August 19th, 2025, kōura were sourced from two catfish-free lakes, (Ōkāreka and Tikitapu (Blue Lake)) in the Rotorua Te Awara Lakes area, Bay of Plenty region of the North Island. On September 25th, 2025, Brown bullhead catfish and longfin eels were sourced from Lake Rotoroa in Hamilton in the Waikato region of the North Island. Experiments were conducted at the Aquatic Research Centre of the University of Waikato. Some kōura were previously used in a mesocosm habitat preference study but never exposed to a predator. They were acclimated for a week in holding tanks under controlled conditions: a 10:14 light: dark cycle reflecting the correct seasonal day-length at a stable temperature of 15.6 °C, pH 8.4 and 10 mg l⁻¹ dissolved oxygen. Kōura were fed every other day fish food pellets (Hikari Tropical carnivore pellets, animal protein 47%). Catfish and eels were held in separate holding tanks, with the same environmental and feeding regime to kōura.</w:t>
+        <w:t xml:space="preserve">In mid-August 2025, kōura were sourced from two catfish-free lakes, (Ōkāreka and Tikitapu (Blue Lake)) in the Rotorua Te Awara Lakes area, Bay of Plenty region of the North Island. In late September 2025, catfish and eels were sourced from Lake Rotoroa in Hamilton in the Waikato region of the North Island. Experiments were conducted at the Aquatic Research Centre of the University of Waikato. All three species were held separately in holding tanks and acclimated for a week in dechlorinated tap water under the following controlled regime: a 10:14 light: dark cycle reflecting the correct seasonal day-length at a stable temperature of 15.6 °C, pH 8.4 and 10 mg l⁻¹ dissolved oxygen, the latter parameters reflecting typical physiochemical condition in source lakes. Kōura and fish were fed every other day on Hikari Tropical carnivore fish food pellets (animal protein 47%). Because kōura are taonga (culturally important) species, permission had to be sought from relevant iwi (Māori tribal unit), as well as relevant government regulator to source a limited number of individuals. Consequently, the experiments were carefully adapted, particularly the feeding study to maximize the use of this finite sample. Similarly, eels, also regarded as taonga, along with individual catfish, were reused throughout the study, respecting ethical and welfare considerations, since their presence alone fulfilled the experimental requirements.</w:t>
+      </w:r>
+    </w:p>
+    <w:bookmarkEnd w:id="10"/>
+    <w:bookmarkStart w:id="11" w:name="refuge-experiment"/>
+    <w:p>
+      <w:pPr>
+        <w:pStyle w:val="Heading2"/>
+      </w:pPr>
+      <w:r>
+        <w:t xml:space="preserve">Refuge experiment</w:t>
+      </w:r>
+    </w:p>
+    <w:p>
+      <w:pPr>
+        <w:pStyle w:val="FirstParagraph"/>
+      </w:pPr>
+      <w:r>
+        <w:t xml:space="preserve">Prior to the experiments, all animals were individually weighed and measured. Only male kōura were used, as male crustaceans are usually the most bold and aggressive</w:t>
+      </w:r>
+      <w:r>
+        <w:t xml:space="preserve"> </w:t>
+      </w:r>
+      <w:r>
+        <w:t xml:space="preserve">(Figler et al., 2005; Stein &amp; Magnuson, 1976)</w:t>
+      </w:r>
+      <w:r>
+        <w:t xml:space="preserve"> </w:t>
+      </w:r>
+      <w:r>
+        <w:t xml:space="preserve">and restricting test animals to a single sex, allowed a smaller overall number of kōura to be used. Kōura had a mean (± SD) orbital carapace length (OCL) of 26.0 mm (± 3.08) (18.35-32.95 mm range) and a mean wet weight of 11.7 g (± 4.25) (3–23 g range). Catfish ranged in length from 260-267 mm and 2.34–3.16 kg wet weight and eels ranged in wet weight from 2.50-3.52 kg, both these size ranges being able to consume adult kōura</w:t>
+      </w:r>
+      <w:r>
+        <w:t xml:space="preserve"> </w:t>
+      </w:r>
+      <w:r>
+        <w:t xml:space="preserve">(Barnes &amp; Hicks, 2003; Hicks, 1997; Ryan, 2009)</w:t>
+      </w:r>
+      <w:r>
+        <w:t xml:space="preserve">.</w:t>
       </w:r>
     </w:p>
     <w:p>
@@ -285,33 +483,7 @@
         <w:pStyle w:val="BodyText"/>
       </w:pPr>
       <w:r>
-        <w:t xml:space="preserve">Because kōura are taonga (culturally important) species, permission had to be sought from relevant iwi (Māori tribal unit), as well as relevant government regulator to source a limited number of animals. Experiments were adapted, particularly the feeding study to make the best use of the finite number of collected animals. As this study focused on kōura the catfish and eels were reused repeatedly in the study.</w:t>
-      </w:r>
-    </w:p>
-    <w:bookmarkEnd w:id="21"/>
-    <w:bookmarkStart w:id="22" w:name="refuge-experiment"/>
-    <w:p>
-      <w:pPr>
-        <w:pStyle w:val="Heading2"/>
-      </w:pPr>
-      <w:r>
-        <w:t xml:space="preserve">Refuge experiment</w:t>
-      </w:r>
-    </w:p>
-    <w:p>
-      <w:pPr>
-        <w:pStyle w:val="FirstParagraph"/>
-      </w:pPr>
-      <w:r>
-        <w:t xml:space="preserve">Prior to the experiments, all animals were individually weighed and measured. Only male kōura were used. Kōura had a mean (± SD) orbital carapace length (OCL) of 26.0 mm (± 3.08) (18.35-32.95 mm range) and a mean wet weight of 11.7 g (± 4.25) (3–23 g range). Catfish ranged in length from 260-267 mm and 2.34 – 3.16 kg wet weight and eels ranged in length from ? and 2.50-3.52 kg wet weight.</w:t>
-      </w:r>
-    </w:p>
-    <w:p>
-      <w:pPr>
-        <w:pStyle w:val="BodyText"/>
-      </w:pPr>
-      <w:r>
-        <w:t xml:space="preserve">Experiments were conducted in 38 L glass tanks (600 × 200 × 220 mm) with each tank having three sides (apart from front of tank) blacked out to block visual cues from neighbouring tanks. Each tank was divided into two compartments by a 0.5 mm steel mesh divider, allowing visual and chemical cues between compartments, while preventing physical contact between animals on either side of barrier (</w:t>
+        <w:t xml:space="preserve">Experiments were conducted in 38 L glass tanks (600 × 200 × 220 mm) with each tank having three sides (apart from front of tank) blacked out to block visual cues from neighbouring tanks. Each tank was divided into two compartments by a 0.5 mm steel mesh divider, allowing visual and chemical cues between compartments, while preventing any physical contact between fish and kōura on either side of barrier (</w:t>
       </w:r>
       <w:hyperlink w:anchor="fig-aquarium-setup">
         <w:r>
@@ -322,7 +494,7 @@
         </w:r>
       </w:hyperlink>
       <w:r>
-        <w:t xml:space="preserve">). All tanks were filled with 26.4 L dechlorinated tap water and had identical environmental regimes as previously detailed for acclimatisation tanks, with water flow provided by an air stone lodged the top of the barrier in each tank. Each tank housed a single kōura on one side of the barrier and either a single predator (catfish or eel) or no predator (control) on the other side. A halved terracotta pot (90 mm diameter × 90 mm depth) was positioned on the kōura side of the tank to serve as a potential refuge. To control for potential tank or side effects, the position of predator treatments within the aquaria was systematically rotated between experimental rounds. The experiment was repeated across five rounds, resulting in 11 catfish replicates, 11 eel replicates, and 10 control replicates. This experiment was first carried out in the light (n = 32 tanks) before being repeated in the dark (n = 32 tanks) with a total of 64 tanks used. Observations were made in the dark using red lighting positioned above the tanks in the same location as the previous normal lighting for the light regime observations. Following each individual experimental run, each tank was thoroughly cleaned and refilled with dechlorinated tap water before reuse. Each individual kōura was only exposed once to a fish predator and there were no mortalities of kōura or fish during the course of experiments. All experiments were conducted within a three-week period (from 1/10/2025 to 16/10/2025), the dark trials following on from the light trials.</w:t>
+        <w:t xml:space="preserve">). All tanks were filled with ~26 L dechlorinated tap water and had identical environmental regimes as previously detailed for acclimatisation tanks, with water flow provided by an air stone lodged at the top of the barrier in each tank. Each tank housed a single kōura on one side of the barrier and either a single predator (catfish or eel) or no predator (control) on the other side. A halved terracotta pot (90 mm diameter × 90 mm depth) was positioned on the kōura side of the tank to serve as a potential refuge. To control for potential tank location or compartment side effects, the position of predator treatments within the aquaria was systematically rotated between experimental rounds. The experiment was repeated across five rounds, resulting in 11 catfish replicates, 11 eel replicates, and 10 control replicates and was first carried out in the light (~400 lux; n = 32) before being repeated in the dark (~70 lux; n = 32). Observations were made in the dark using red lighting positioned centrally above the tanks to minimize disturbance, as many aquatic species have limited sensitivity to red wavelengths and are unlikely to perceive this light. Following each individual experimental run, each tank was thoroughly cleaned and refilled with dechlorinated tap water before reuse. Each individual kōura was only exposed once to a fish predator and there were no mortalities of kōura or fish during experiments. All experiments were conducted within a three-week period during October 2025.</w:t>
       </w:r>
     </w:p>
     <w:p>
@@ -330,23 +502,52 @@
         <w:pStyle w:val="BodyText"/>
       </w:pPr>
       <w:r>
-        <w:t xml:space="preserve">Observations of each kōura location was made 21 times at the following time intervals (in minutes): 0, 5, 10, 20, 30, 45, 60, 61, 65, 70, 80, 90, 120, 150, 210, 240, 245, 260, 275, 290, and 300. An individual kōura were placed in the middle of the tank compartment containing the refuge at 0-minute (its initial location being immediately noted after its addition to the tank) and was removed after the final 300-minute observation. The fish predator was introduced after 60 minutes into the tank on the other side of the barrier from the kōura compartment and removed again at 240 minutes. The control tanks had no fish added but at 60 minutes and again at 240 minutes the water in the</w:t>
-      </w:r>
-      <w:r>
-        <w:t xml:space="preserve"> </w:t>
-      </w:r>
-      <w:r>
-        <w:t xml:space="preserve">‘predator’</w:t>
-      </w:r>
-      <w:r>
-        <w:t xml:space="preserve"> </w:t>
-      </w:r>
-      <w:r>
-        <w:t xml:space="preserve">compartment was disturbed by mixing with a small net for approximately 30 seconds. This was to simulate the disturbance time associated with adding and removing fish in the other treatments. Kōura location within each tank was recorded at each time interval as either refuge (the animal was using the refuge, being inside it or immediately behind it and touching it) or in the open - non-refuge (any other location in the tank where the animal was not in the refuge or touching the refuge).</w:t>
-      </w:r>
-    </w:p>
-    <w:bookmarkEnd w:id="22"/>
-    <w:bookmarkStart w:id="23" w:name="feeding-experiment"/>
+        <w:t xml:space="preserve">At the beginning of each experiment, an individual kōura was placed in the middle of the tank compartment containing the refuge and observations of each kōura location were recorded at 21 time intervals within a 5 hour period (the intervals being: 0, 5, 10, 20, 30, 45, 60, 61, 65, 70, 80, 90, 120, 150, 210, 240, 245, 260, 275, 290, and 300 minutes). The 0-minute recording was the individual’s initial immediate location after its addition to the tank. Kōura location was recorded as either refuge (the animal was using the refuge, being inside it or immediately behind it and touching it) or non-refuge/ in the open (any other location in the tank where the animal was not in the refuge or touching the refuge). The fish predator was introduced into the tank on the other side of the barrier from the kōura compartment, after 60 minutes and removed after 240 minutes. The control tanks had no fish added but at 60 minutes and again at 240 minutes, the water in the ‘predator’ compartment was mechanically disturbed by agitating the water with a small hand net for approximately 30 seconds. This was to simulate the disturbance time associated with adding and removing fish in the other treatments with the same size hand net. At the end of each experiment, the kōura was removed after the final 300-minute observation.</w:t>
+      </w:r>
+    </w:p>
+    <w:p>
+      <w:pPr>
+        <w:pStyle w:val="BodyText"/>
+      </w:pPr>
+      <w:r>
+        <w:t xml:space="preserve">To analyse kōura refuge use, a beta-binomial generalized linear mixed-effects model (GLMM) was fitted using the glmmTMB package in R</w:t>
+      </w:r>
+      <w:r>
+        <w:t xml:space="preserve"> </w:t>
+      </w:r>
+      <w:r>
+        <w:t xml:space="preserve">(Brooks et al., 2017; R Core Team, 2025)</w:t>
+      </w:r>
+      <w:r>
+        <w:t xml:space="preserve">. The response variable was the number of observations where kōura were using a refuge out of total observations per experiment round, treatment (catfish, eel, control), light condition (light, dark), period (before, during, after fish addition / mechanical disturbance) included as fixed effects. A beta-binomial distribution was used to account for overdispersion in the binomial proportion data. Model selection was conducted by comparing candidate models differing in fixed effect structure and random effects inclusion using AIC, with the model with the lowest AIC selected as optimal. The need for a tank-level and round-level random intercept was evaluated by comparing AIC between models with and without this term. Model fit of the final model was assessed using DHARMa simulation-based residuals, including tests for overdispersion and zero-inflation</w:t>
+      </w:r>
+      <w:r>
+        <w:t xml:space="preserve"> </w:t>
+      </w:r>
+      <w:r>
+        <w:t xml:space="preserve">(</w:t>
+      </w:r>
+      <w:r>
+        <w:t xml:space="preserve">Hartig et al.</w:t>
+      </w:r>
+      <w:r>
+        <w:t xml:space="preserve">, 2024)</w:t>
+      </w:r>
+      <w:r>
+        <w:t xml:space="preserve">. Marginal means and pairwise contrasts between factor levels were obtained using the emmeans package</w:t>
+      </w:r>
+      <w:r>
+        <w:t xml:space="preserve"> </w:t>
+      </w:r>
+      <w:r>
+        <w:t xml:space="preserve">(Lenth et al., 2026)</w:t>
+      </w:r>
+      <w:r>
+        <w:t xml:space="preserve">. Spearman rank correlations were also used to investigate potential relationships between kōura body size (OCL) and overall refuge use (all time intervals combined) in the three treatments.</w:t>
+      </w:r>
+    </w:p>
+    <w:bookmarkEnd w:id="11"/>
+    <w:bookmarkStart w:id="12" w:name="feeding-experiment"/>
     <w:p>
       <w:pPr>
         <w:pStyle w:val="Heading2"/>
@@ -360,25 +561,36 @@
         <w:pStyle w:val="FirstParagraph"/>
       </w:pPr>
       <w:r>
-        <w:t xml:space="preserve">The feeding behaviour experiments were executed in 16 glass tanks of 9.25L (320 × 170 × 170 mm) filled with 5 L dechlorinated tap water and a halved terracotta pot (90 mm diameter × 90 mm depth). In three rounds a total of 46 male and two female kōura were placed individually in each tank. Kōura had a mean (± SD) orbital carapace length (OCL) of 27.84 mm (± 4.72) (20.48-41.15 mm range) and a mean wet weight of 15.65 g (± 8.84) (6-44 g range). For each round kōura were starved for different periods (0, 3 and 4 days) prior to the feeding experiment to also investigate how starvation period influenced feeding motivation.</w:t>
-      </w:r>
-    </w:p>
-    <w:p>
-      <w:pPr>
-        <w:pStyle w:val="BodyText"/>
-      </w:pPr>
-      <w:r>
-        <w:t xml:space="preserve">Kairomones from catfish and eels were collected by placing 4 fish (catfish or eel) in a 10 L bucket filled with water from the holding tanks for 15 minutes to concentrate the kairomones in the water. 1 L from the buckets was added to the tank with the kōura in it and for the controls 1 L of dechlorinated tap water was added. Next, 10 Hikari Tropical carnivore pellets were added to each tank. After 24 hours, when each experiment terminated, the number of pellets eaten (to the nearest quarter pellet) was counted and the feeding rate (pellets consumed per g kōura) calculated. As stated previously, the feeding study was adapted to make the best use of the finite number of collected taonga animals and the following protocols reflect this. After 0 days starvation, 16 kōura (14 male and 2 female) were exposed to eel water (n = 5), catfish water (n = 6) or control water (n = 5). After 3 days starvation, 16 kōura (male only) were exposed to eel water (n = 6), catfish water (n = 5) or control water (n = 5). After 4 days starvation, 16 kōura (male only) were exposed to eel water (n = 5), catfish water (n = 5) or control water (n = 6).</w:t>
-      </w:r>
-    </w:p>
-    <w:bookmarkEnd w:id="23"/>
-    <w:bookmarkStart w:id="24" w:name="data-analysis"/>
+        <w:t xml:space="preserve">Experiments were conducted in glass tanks (320 × 170 × 170 mm), containing 5 L dechlorinated tap water and a halved terracotta pot (90 mm diameter × 90 mm depth). Catfish and eels had been held at the same density in separate identical holding tanks for a week prior to experiment. Fish exudates were collected by placing four fish (catfish or eel) in a 10 L bucket filled with water from the holding tanks for 15 minutes to concentrate the kairomones in the water. For eel and catfish treatments, 1 L from the buckets was added to each tank already holding 5 L of tap water, and for control an additional 1 L of tap water was added. Next, 10 Hikari Tropical carnivore pellets were added to each tank. Trial experiments showed these pellets remained intact for over 24 hours in tap water. In three rounds, a total of 48 kōura (46 male, 2 female) were weighed and measured. Their mean (± SD) wet weight of 15.65 g (± 8.84), ranging from 6.00 to 44.00 g, and the mean (± SD) OCL was 27.84 mm (± 4.72), with a range of 20.48 to 41.15 mm. Each kōura was then placed individually in a tank. For each round kōura were starved for different periods (either 0, 3 or 4 days) prior to the feeding experiment to also investigate how starvation period influenced feeding motivation. After 0 days starvation, 16 kōura (14 male and 2 female) were exposed to eel water (n = 5), catfish water (n = 6) or control water (n = 5). After 3 days starvation, 16 kōura (male only) were exposed to eel water (n = 6), catfish water (n = 5) or control water (n = 5). After 4 days starvation, 16 kōura (male only) were exposed to eel water (n = 5), catfish water (n = 5) or control water (n = 6). After 24 hours, when each experiment was terminated, the number of pellets eaten (to the nearest quarter pellet) was counted and the feeding rate (pellets eaten per gram of wet weight (WW) of kōura) calculated. As stated previously, the feeding study was adapted to make the best use of a finite number of collected taonga animals. Kōura feeding rate was analysed using a linear model with pellets consumed per gram body weight as the response, with treatment (catfish, eel, control) and starvation period (0, 3, 4) as fixed effects. Because each starvation period was conducted in a separate experimental round, starvation period and round were fully confounded by design, precluding the inclusion of round as a random effect. Overall significance of fixed effects was assessed using Type III ANOVA [car package;</w:t>
+      </w:r>
+      <w:r>
+        <w:t xml:space="preserve"> </w:t>
+      </w:r>
+      <w:r>
+        <w:t xml:space="preserve">Fox &amp; Weisberg (2018)</w:t>
+      </w:r>
+      <w:r>
+        <w:t xml:space="preserve">], and model assumptions were verified using residual plots and testing normality of residuals using the Shapiro-Wilk test. Pairwise comparisons between treatment and starvation level combinations were conducted using estimated marginal means.</w:t>
+      </w:r>
+    </w:p>
+    <w:bookmarkEnd w:id="12"/>
+    <w:bookmarkEnd w:id="13"/>
+    <w:bookmarkStart w:id="16" w:name="results"/>
+    <w:p>
+      <w:pPr>
+        <w:pStyle w:val="Heading1"/>
+      </w:pPr>
+      <w:r>
+        <w:t xml:space="preserve">Results</w:t>
+      </w:r>
+    </w:p>
+    <w:bookmarkStart w:id="14" w:name="refuge-experiment-1"/>
     <w:p>
       <w:pPr>
         <w:pStyle w:val="Heading2"/>
       </w:pPr>
       <w:r>
-        <w:t xml:space="preserve">Data analysis</w:t>
+        <w:t xml:space="preserve">Refuge experiment</w:t>
       </w:r>
     </w:p>
     <w:p>
@@ -386,43 +598,117 @@
         <w:pStyle w:val="FirstParagraph"/>
       </w:pPr>
       <w:r>
-        <w:t xml:space="preserve">To analyse kōura refuge use a beta-binomial generalized linear mixed-effects model (GLMM; BRON) fitted using the glmmTMB package in R (BRON; BRON). The response variable was the number of observations in refuge out of total observations per experiment round, treatment (catfish/eel/control), light condition (light, dark), period (before/during/after) included as fixed effects. A beta-binomial distribution was used to account for overdispersion in the binomial proportion data. Model selection was conducted by comparing candidate models differing in fixed effect structure and random effect inclusion using AIC, with the model with the lowest AIC selected as optimal. The need for a tank-level random intercept was evaluated by comparing AIC between models with and without this term. Model fit of the final model was assessed using DHARMa simulation-based residuals, including tests for overdispersion and zero-inflation (Hartig et al., 2024). Marginal means and pairwise contrasts between factor levels were obtained using the emmeans package (Lenth et al., 2026).</w:t>
-      </w:r>
-    </w:p>
-    <w:p>
-      <w:pPr>
-        <w:pStyle w:val="BodyText"/>
-      </w:pPr>
-      <w:r>
-        <w:t xml:space="preserve">The feeding rate was analysed using a linear model with pellets consumed per gram body weight as the response, and treatment (catfish, eel, control) and starvation period (0, 3, 4) as fixed effects, including their interaction. Because each starvation period was conducted in a separate experimental round, starvation period and round were fully confounded by design, precluding the inclusion of round as a random effect. Overall significance of fixed effects was assessed using Type III ANOVA (car package; Fox &amp; Weisberg, 2018), and model assumptions were verified using residual plots and testing normality of residuals using the Shapiro-Wilk test. Pairwise comparisons between treatment and starvation level combinations were conducted using estimated marginal.</w:t>
-      </w:r>
-    </w:p>
-    <w:bookmarkEnd w:id="24"/>
-    <w:bookmarkEnd w:id="25"/>
-    <w:bookmarkStart w:id="28" w:name="results"/>
-    <w:p>
-      <w:pPr>
-        <w:pStyle w:val="Heading1"/>
-      </w:pPr>
-      <w:r>
-        <w:t xml:space="preserve">Results</w:t>
-      </w:r>
-    </w:p>
-    <w:bookmarkStart w:id="26" w:name="refuge-experiment-1"/>
-    <w:p>
-      <w:pPr>
-        <w:pStyle w:val="Heading2"/>
-      </w:pPr>
-      <w:r>
-        <w:t xml:space="preserve">Refuge experiment</w:t>
-      </w:r>
-    </w:p>
-    <w:p>
-      <w:pPr>
-        <w:pStyle w:val="FirstParagraph"/>
-      </w:pPr>
-      <w:r>
         <w:t xml:space="preserve">The proportion of time kōura spent in refuge varied across treatments, experimental periods, and light conditions (</w:t>
+      </w:r>
+      <w:hyperlink w:anchor="fig-emmeans-plot">
+        <w:r>
+          <w:rPr>
+            <w:rStyle w:val="Hyperlink"/>
+          </w:rPr>
+          <w:t xml:space="preserve">Figure 3</w:t>
+        </w:r>
+      </w:hyperlink>
+      <w:r>
+        <w:t xml:space="preserve">,</w:t>
+      </w:r>
+      <w:r>
+        <w:t xml:space="preserve"> </w:t>
+      </w:r>
+      <w:hyperlink w:anchor="tbl-s1-refuge-prop">
+        <w:r>
+          <w:rPr>
+            <w:rStyle w:val="Hyperlink"/>
+          </w:rPr>
+          <w:t xml:space="preserve">Table 1</w:t>
+        </w:r>
+      </w:hyperlink>
+      <w:r>
+        <w:t xml:space="preserve">). A beta-binomial GLMM without a random intercept was the best-supported model based on the lowest AIC, with full model coefficients reported in</w:t>
+      </w:r>
+      <w:r>
+        <w:t xml:space="preserve"> </w:t>
+      </w:r>
+      <w:hyperlink w:anchor="tbl-s2-fixed-effects">
+        <w:r>
+          <w:rPr>
+            <w:rStyle w:val="Hyperlink"/>
+          </w:rPr>
+          <w:t xml:space="preserve">Table 2</w:t>
+        </w:r>
+      </w:hyperlink>
+      <w:r>
+        <w:t xml:space="preserve">. Refuge use by kōura was consistently higher when exposed to catfish than eel (</w:t>
+      </w:r>
+      <w:r>
+        <w:rPr>
+          <w:i/>
+          <w:iCs/>
+        </w:rPr>
+        <w:t xml:space="preserve">p</w:t>
+      </w:r>
+      <w:r>
+        <w:t xml:space="preserve"> </w:t>
+      </w:r>
+      <w:r>
+        <w:t xml:space="preserve">= 0.01,</w:t>
+      </w:r>
+      <w:r>
+        <w:t xml:space="preserve"> </w:t>
+      </w:r>
+      <w:hyperlink w:anchor="fig-emmeans-plot">
+        <w:r>
+          <w:rPr>
+            <w:rStyle w:val="Hyperlink"/>
+          </w:rPr>
+          <w:t xml:space="preserve">Figure 3</w:t>
+        </w:r>
+      </w:hyperlink>
+      <w:r>
+        <w:t xml:space="preserve">,</w:t>
+      </w:r>
+      <w:r>
+        <w:t xml:space="preserve"> </w:t>
+      </w:r>
+      <w:hyperlink w:anchor="tbl-s3-emmeans">
+        <w:r>
+          <w:rPr>
+            <w:rStyle w:val="Hyperlink"/>
+          </w:rPr>
+          <w:t xml:space="preserve">Table 3</w:t>
+        </w:r>
+      </w:hyperlink>
+      <w:r>
+        <w:t xml:space="preserve">). However, there were no significant differences in kōura refuge use between either fish treatment and the control (both</w:t>
+      </w:r>
+      <w:r>
+        <w:t xml:space="preserve"> </w:t>
+      </w:r>
+      <w:r>
+        <w:rPr>
+          <w:i/>
+          <w:iCs/>
+        </w:rPr>
+        <w:t xml:space="preserve">p</w:t>
+      </w:r>
+      <w:r>
+        <w:t xml:space="preserve"> </w:t>
+      </w:r>
+      <w:r>
+        <w:t xml:space="preserve">= for catfish and control and eel and control;</w:t>
+      </w:r>
+      <w:r>
+        <w:t xml:space="preserve"> </w:t>
+      </w:r>
+      <w:hyperlink w:anchor="fig-emmeans-plot">
+        <w:r>
+          <w:rPr>
+            <w:rStyle w:val="Hyperlink"/>
+          </w:rPr>
+          <w:t xml:space="preserve">Figure 3</w:t>
+        </w:r>
+      </w:hyperlink>
+      <w:r>
+        <w:t xml:space="preserve">). Under light conditions, the pattern of refuge use in the control treatment was more similar to the catfish treatment, whereas under dark conditions it more resembled the eel treatment (</w:t>
       </w:r>
       <w:hyperlink w:anchor="fig-refuge-plot">
         <w:r>
@@ -433,43 +719,7 @@
         </w:r>
       </w:hyperlink>
       <w:r>
-        <w:t xml:space="preserve">,</w:t>
-      </w:r>
-      <w:r>
-        <w:t xml:space="preserve"> </w:t>
-      </w:r>
-      <w:hyperlink w:anchor="tbl-s1-refuge-prop">
-        <w:r>
-          <w:rPr>
-            <w:rStyle w:val="Hyperlink"/>
-          </w:rPr>
-          <w:t xml:space="preserve">Table 1</w:t>
-        </w:r>
-      </w:hyperlink>
-      <w:r>
-        <w:t xml:space="preserve">). Under dark conditions, refuge use increased across the experimental period in the catfish treatment, rising from 0.39 before to 0.7 after exposure, while the control showed a smaller increase (0.37 to 0.47) and eel-exposed kōura showed little change (0.27 before, 0.41 during, and 0.36 after). Under light conditions, refuge use was generally higher than under dark conditions, with catfish (0.52 before to 0.73 after) and control (0.4 to 0.82) both showing increases across periods, while eel-exposed kōura showed a smaller increase (0.35 to 0.53).</w:t>
-      </w:r>
-    </w:p>
-    <w:p>
-      <w:pPr>
-        <w:pStyle w:val="BodyText"/>
-      </w:pPr>
-      <w:r>
-        <w:t xml:space="preserve">A beta-binomial GLMM with experimental unit as a random intercept was the best supported model (lowest AIC). Full model coefficients are reported in</w:t>
-      </w:r>
-      <w:r>
-        <w:t xml:space="preserve"> </w:t>
-      </w:r>
-      <w:hyperlink w:anchor="tbl-s2-fixed-effects">
-        <w:r>
-          <w:rPr>
-            <w:rStyle w:val="Hyperlink"/>
-          </w:rPr>
-          <w:t xml:space="preserve">Table 2</w:t>
-        </w:r>
-      </w:hyperlink>
-      <w:r>
-        <w:t xml:space="preserve">. Refuge use was most affected by period with more kōura using the refuge as the experiment progressed. Refuge use was significantly more in the during period than in the before period (</w:t>
+        <w:t xml:space="preserve">). Light regime had a significant effect on refuge use (</w:t>
       </w:r>
       <w:r>
         <w:rPr>
@@ -482,10 +732,7 @@
         <w:t xml:space="preserve"> </w:t>
       </w:r>
       <w:r>
-        <w:t xml:space="preserve">= 0.144,</w:t>
-      </w:r>
-      <w:r>
-        <w:t xml:space="preserve"> </w:t>
+        <w:t xml:space="preserve">= ), with greater refuge use under light compared to dark conditions (</w:t>
       </w:r>
       <w:hyperlink w:anchor="fig-emmeans-plot">
         <w:r>
@@ -496,21 +743,24 @@
         </w:r>
       </w:hyperlink>
       <w:r>
-        <w:t xml:space="preserve">,</w:t>
-      </w:r>
-      <w:r>
-        <w:t xml:space="preserve"> </w:t>
-      </w:r>
-      <w:hyperlink w:anchor="tbl-s3-emmeans">
+        <w:t xml:space="preserve"> </w:t>
+      </w:r>
+      <w:r>
+        <w:t xml:space="preserve">and</w:t>
+      </w:r>
+      <w:r>
+        <w:t xml:space="preserve"> </w:t>
+      </w:r>
+      <w:hyperlink w:anchor="fig-refuge-plot">
         <w:r>
           <w:rPr>
             <w:rStyle w:val="Hyperlink"/>
           </w:rPr>
-          <w:t xml:space="preserve">Table 3</w:t>
+          <w:t xml:space="preserve">Figure 2</w:t>
         </w:r>
       </w:hyperlink>
       <w:r>
-        <w:t xml:space="preserve">). This was also the case between before and after period (</w:t>
+        <w:t xml:space="preserve">). Regarding experimental periods, refuge use was significantly lower in the period just before fish were introduced (or first 30-second mechanical disturbance initiated) compared to period just after the fish had been removed (or second mechanical disturbance ceased) (</w:t>
       </w:r>
       <w:r>
         <w:rPr>
@@ -523,120 +773,78 @@
         <w:t xml:space="preserve"> </w:t>
       </w:r>
       <w:r>
-        <w:t xml:space="preserve">= 0.007), but not between during and after (</w:t>
-      </w:r>
-      <w:r>
-        <w:rPr>
-          <w:i/>
-          <w:iCs/>
-        </w:rPr>
-        <w:t xml:space="preserve">p</w:t>
-      </w:r>
-      <w:r>
-        <w:t xml:space="preserve"> </w:t>
-      </w:r>
-      <w:r>
-        <w:t xml:space="preserve">= 0.409). Neither treatment nor light condition significantly affected refuge use. No significant differences were found between catfish and eel (</w:t>
-      </w:r>
-      <w:r>
-        <w:rPr>
-          <w:i/>
-          <w:iCs/>
-        </w:rPr>
-        <w:t xml:space="preserve">p</w:t>
-      </w:r>
-      <w:r>
-        <w:t xml:space="preserve"> </w:t>
-      </w:r>
-      <w:r>
-        <w:t xml:space="preserve">= 0.01), catfish and control (</w:t>
-      </w:r>
-      <w:r>
-        <w:rPr>
-          <w:i/>
-          <w:iCs/>
-        </w:rPr>
-        <w:t xml:space="preserve">p</w:t>
-      </w:r>
-      <w:r>
-        <w:t xml:space="preserve"> </w:t>
-      </w:r>
-      <w:r>
-        <w:t xml:space="preserve">= ), or control and eel (</w:t>
-      </w:r>
-      <w:r>
-        <w:rPr>
-          <w:i/>
-          <w:iCs/>
-        </w:rPr>
-        <w:t xml:space="preserve">p</w:t>
-      </w:r>
-      <w:r>
-        <w:t xml:space="preserve"> </w:t>
-      </w:r>
-      <w:r>
-        <w:t xml:space="preserve">= 0.314). Light condition was also not significant (</w:t>
-      </w:r>
-      <w:r>
-        <w:rPr>
-          <w:i/>
-          <w:iCs/>
-        </w:rPr>
-        <w:t xml:space="preserve">p</w:t>
-      </w:r>
-      <w:r>
-        <w:t xml:space="preserve"> </w:t>
-      </w:r>
-      <w:r>
-        <w:t xml:space="preserve">= ).</w:t>
-      </w:r>
-    </w:p>
-    <w:bookmarkEnd w:id="26"/>
-    <w:bookmarkStart w:id="27" w:name="feeding-experiment-1"/>
-    <w:p>
-      <w:pPr>
-        <w:pStyle w:val="Heading2"/>
-      </w:pPr>
-      <w:r>
-        <w:t xml:space="preserve">Feeding experiment</w:t>
-      </w:r>
-    </w:p>
-    <w:p>
-      <w:pPr>
-        <w:pStyle w:val="FirstParagraph"/>
-      </w:pPr>
-      <w:r>
-        <w:t xml:space="preserve">The feeding experiment showed the highest mean (±SE) feeding rate was after 3 days of starvation in the catfish treatment (0.235 ± 0.037 pellets g⁻¹). The linear model showed starvation period had significant effect on feeding rate (</w:t>
-      </w:r>
-      <w:r>
-        <w:rPr>
-          <w:i/>
-          <w:iCs/>
-        </w:rPr>
-        <w:t xml:space="preserve">p</w:t>
-      </w:r>
-      <w:r>
-        <w:t xml:space="preserve"> </w:t>
-      </w:r>
-      <w:r>
-        <w:t xml:space="preserve">= 4</w:t>
-      </w:r>
-      <w:r>
-        <w:t xml:space="preserve">^{-4},</w:t>
-      </w:r>
-      <w:r>
-        <w:t xml:space="preserve"> </w:t>
-      </w:r>
-      <w:hyperlink w:anchor="tbl-s4-feeding-anova">
+        <w:t xml:space="preserve">= 0.007;</w:t>
+      </w:r>
+      <w:r>
+        <w:t xml:space="preserve"> </w:t>
+      </w:r>
+      <w:hyperlink w:anchor="fig-emmeans-plot">
         <w:r>
           <w:rPr>
             <w:rStyle w:val="Hyperlink"/>
           </w:rPr>
-          <w:t xml:space="preserve">Table 4</w:t>
+          <w:t xml:space="preserve">Figure 3</w:t>
         </w:r>
       </w:hyperlink>
       <w:r>
-        <w:t xml:space="preserve">). Treatment had no significant effect on feeding rate (</w:t>
+        <w:t xml:space="preserve"> </w:t>
+      </w:r>
+      <w:r>
+        <w:t xml:space="preserve">and</w:t>
+      </w:r>
+      <w:r>
+        <w:t xml:space="preserve"> </w:t>
+      </w:r>
+      <w:hyperlink w:anchor="fig-refuge-plot">
+        <w:r>
+          <w:rPr>
+            <w:rStyle w:val="Hyperlink"/>
+          </w:rPr>
+          <w:t xml:space="preserve">Figure 2</w:t>
+        </w:r>
+      </w:hyperlink>
+      <w:r>
+        <w:t xml:space="preserve">). No significant differences were found between the before and during periods, or between the during and after periods. There was also no relationship between kōura OCL and refuge use in any of the three treatments (rs = -0.09, 0.09 and 0.17 for catfish, eel and control treatments respectively, all NS).</w:t>
+      </w:r>
+    </w:p>
+    <w:p>
+      <w:pPr>
+        <w:pStyle w:val="BodyText"/>
+      </w:pPr>
+      <w:r>
+        <w:t xml:space="preserve">For all treatments, we observed individual kōura within the laboratory population appeared highly variable in their movement around tanks and use of refuges, even in the time intervals comprising the first 60 minutes of the experiment, before fish were introduced. The coefficient of variations (CVs) for kōura refuge use in the light and the dark before fish introduction were similarly high, being 60.4 % and 58.2 % (both n = 32) respectively, confirming high baseline variation in kōura refuge use, regardless of treatment type. Despite this inherent variation in individual kōura behaviour, clear patterns in kōura refuge use were evident over the course of the experiment. Under light conditions, the control showed the largest overall increase in refuge use (0.440 % to 0.8282 %), driven primarily by a sharp rise in the after period, while the catfish treatment showed a more sustained increase across all periods (0.5252 % to 0.7373 %) and the eel treatment the smallest increase (0.3535 % to 0.5353 %;</w:t>
+      </w:r>
+      <w:r>
+        <w:t xml:space="preserve"> </w:t>
+      </w:r>
+      <w:hyperlink w:anchor="fig-refuge-plot">
+        <w:r>
+          <w:rPr>
+            <w:rStyle w:val="Hyperlink"/>
+          </w:rPr>
+          <w:t xml:space="preserve">Figure 2</w:t>
+        </w:r>
+      </w:hyperlink>
+      <w:r>
+        <w:t xml:space="preserve">). Under dark conditions, the pattern shifted, with the catfish treatment showing the greatest increase (0.3939 % to 0.770 %), while the eel treatment showed a modest and non-sustained increase (0.2727 % to 0.4141 % during exposure, returning to 0.3636 % after), and the control remained comparatively low throughout (0.4737 % to 0.4747 %).</w:t>
+      </w:r>
+    </w:p>
+    <w:bookmarkEnd w:id="14"/>
+    <w:bookmarkStart w:id="15" w:name="feeding-experiment-1"/>
+    <w:p>
+      <w:pPr>
+        <w:pStyle w:val="Heading2"/>
+      </w:pPr>
+      <w:r>
+        <w:t xml:space="preserve">Feeding experiment</w:t>
+      </w:r>
+    </w:p>
+    <w:p>
+      <w:pPr>
+        <w:pStyle w:val="FirstParagraph"/>
+      </w:pPr>
+      <w:r>
+        <w:t xml:space="preserve">While the linear model showed starvation period had a significant effect on feeding rate (</w:t>
       </w:r>
       <w:r>
         <w:rPr>
@@ -649,20 +857,13 @@
         <w:t xml:space="preserve"> </w:t>
       </w:r>
       <w:r>
-        <w:t xml:space="preserve">= 0.968), and the interaction between the treatment and starvation period was not significant (</w:t>
-      </w:r>
-      <w:r>
-        <w:rPr>
-          <w:i/>
-          <w:iCs/>
-        </w:rPr>
-        <w:t xml:space="preserve">p</w:t>
-      </w:r>
-      <w:r>
-        <w:t xml:space="preserve"> </w:t>
-      </w:r>
-      <w:r>
-        <w:t xml:space="preserve">= 0.082), although a marginal trend was observed (</w:t>
+        <w:t xml:space="preserve">= 4</w:t>
+      </w:r>
+      <w:r>
+        <w:t xml:space="preserve">^{-4},</w:t>
+      </w:r>
+      <w:r>
+        <w:t xml:space="preserve"> </w:t>
       </w:r>
       <w:hyperlink w:anchor="fig-feeding-plot">
         <w:r>
@@ -673,12 +874,51 @@
         </w:r>
       </w:hyperlink>
       <w:r>
-        <w:t xml:space="preserve">). No significant difference was found in feeding rate between catfish, eel, and control treatments within each of the starvation periods, this suggests that predator kairomones did not affect feeding behaviour in kōura within this experiment.</w:t>
-      </w:r>
-    </w:p>
-    <w:bookmarkEnd w:id="27"/>
-    <w:bookmarkEnd w:id="28"/>
-    <w:bookmarkStart w:id="32" w:name="discussion"/>
+        <w:t xml:space="preserve">;</w:t>
+      </w:r>
+      <w:r>
+        <w:t xml:space="preserve"> </w:t>
+      </w:r>
+      <w:r>
+        <w:rPr>
+          <w:b/>
+          <w:bCs/>
+        </w:rPr>
+        <w:t xml:space="preserve">?@tbl-s4-feeding-ano</w:t>
+      </w:r>
+      <w:r>
+        <w:t xml:space="preserve">), there was no significant difference in feeding rate between catfish, eel, and control treatments (</w:t>
+      </w:r>
+      <w:r>
+        <w:rPr>
+          <w:i/>
+          <w:iCs/>
+        </w:rPr>
+        <w:t xml:space="preserve">p</w:t>
+      </w:r>
+      <w:r>
+        <w:t xml:space="preserve"> </w:t>
+      </w:r>
+      <w:r>
+        <w:t xml:space="preserve">= 0.968). There was a marginal interaction between treatment and starvation period (</w:t>
+      </w:r>
+      <w:r>
+        <w:rPr>
+          <w:i/>
+          <w:iCs/>
+        </w:rPr>
+        <w:t xml:space="preserve">p</w:t>
+      </w:r>
+      <w:r>
+        <w:t xml:space="preserve"> </w:t>
+      </w:r>
+      <w:r>
+        <w:t xml:space="preserve">= 0.082), with feeding rate in the control treatment appearing to increase with starvation period in a pattern not evident in the fish treatments. After 4 days starvation, the mean (±SE) kōura feeding rate (pellets g WW⁻¹) for the control was over two and a half times that of the catfish and eel treatments (0.148 ±0.050 pellets g WW⁻¹ compared to 0.059 ± 0.017 and 0.052 ± 0.028 pellets g WW⁻¹ respectively).</w:t>
+      </w:r>
+    </w:p>
+    <w:bookmarkEnd w:id="15"/>
+    <w:bookmarkEnd w:id="16"/>
+    <w:bookmarkStart w:id="18" w:name="discussion"/>
     <w:p>
       <w:pPr>
         <w:pStyle w:val="Heading1"/>
@@ -687,38 +927,229 @@
         <w:t xml:space="preserve">Discussion</w:t>
       </w:r>
     </w:p>
-    <w:bookmarkStart w:id="29" w:name="refuge-experiment-2"/>
+    <w:p>
+      <w:pPr>
+        <w:pStyle w:val="FirstParagraph"/>
+      </w:pPr>
+      <w:r>
+        <w:t xml:space="preserve">Predatory fish presence can generate a NCE on kōura by increasing the amount of time they spend in refuges. This can reduce the time available for foraging which may lead to reduced growth and reproduction, ultimately impacting the prey species at the population level (</w:t>
+      </w:r>
+      <w:r>
+        <w:t xml:space="preserve">Preisser et al. (2005)</w:t>
+      </w:r>
+      <w:r>
+        <w:t xml:space="preserve">;</w:t>
+      </w:r>
+      <w:r>
+        <w:t xml:space="preserve"> </w:t>
+      </w:r>
+      <w:r>
+        <w:t xml:space="preserve">Sheriff et al. (2020)</w:t>
+      </w:r>
+      <w:r>
+        <w:t xml:space="preserve">). Although it was notable that refuge use in all treatments before fish were added, was similar and highly variable, our experiments nevertheless revealed clear differences between kōura responses to catfish and eels, with the invader consistently provoking greater refuge-use than the native. However, the control treatment, which had kōura exposed only to two 30 second periods of water disturbance during the same period that kōura were exposed to fish predators for three hours, also elicited increasing refuge use over time, particularly under light conditions. This is unsurprising given that kōura are nocturnally adapted, with the need to remain hidden during daylight to avoid visual predators such as birds</w:t>
+      </w:r>
+      <w:r>
+        <w:t xml:space="preserve"> </w:t>
+      </w:r>
+      <w:r>
+        <w:t xml:space="preserve">(Devcich, 1979)</w:t>
+      </w:r>
+      <w:r>
+        <w:t xml:space="preserve">, but does indicate our interpretation of apparent NCEs need to be treated with caution, as the experimental set up was highly artificial and despite acclimatisation efforts, all kōura responses need to be judged in that context. Despite this, the same pattern of catfish presence causing greater refuge use than eel, in the dark, as well as the light does indicate we were witnessing real differences in NCEs.</w:t>
+      </w:r>
+    </w:p>
+    <w:p>
+      <w:pPr>
+        <w:pStyle w:val="BodyText"/>
+      </w:pPr>
+      <w:r>
+        <w:t xml:space="preserve">When exposed to an unfamiliar, novel predator cue, kōura significantly increased their refuge use, indicating a strong antipredator response. For naïve prey, unfamiliar cues could trigger a precautionary response because the consequences of ignoring a potentially real predation threat could be fatal, even when, in reality, the actual predation risk is absent</w:t>
+      </w:r>
+      <w:r>
+        <w:t xml:space="preserve"> </w:t>
+      </w:r>
+      <w:r>
+        <w:t xml:space="preserve">(Dawkins &amp; Krebs, 1979; Lima &amp; Dill, 1990)</w:t>
+      </w:r>
+      <w:r>
+        <w:t xml:space="preserve">. Such generalised responses to novel stimuli tend to be overcautious and energetically costly and are characteristic of prey with no evolutionary history with the encountered predator</w:t>
+      </w:r>
+      <w:r>
+        <w:t xml:space="preserve"> </w:t>
+      </w:r>
+      <w:r>
+        <w:t xml:space="preserve">(Sih et al., 2010)</w:t>
+      </w:r>
+      <w:r>
+        <w:t xml:space="preserve">. This is consistent with the pattern observed in this study as, kōura demonstrated greater refuge-seeking behaviour when exposed to the non-native catfish than to native longfin eels, a difference that likely reflects their evolutionary history with eels but not catfish. The unfamiliar and unpredictable cues from catfish may therefore trigger a heightened precautionary response relative to the more familiar eel cues</w:t>
+      </w:r>
+      <w:r>
+        <w:t xml:space="preserve"> </w:t>
+      </w:r>
+      <w:r>
+        <w:t xml:space="preserve">(Ehlman et al., 2019; Sih et al., 2023)</w:t>
+      </w:r>
+      <w:r>
+        <w:t xml:space="preserve">. While refuge use in the control group was intermediate and did not differ significantly from either predator treatment, the consistent difference between catfish and eel treatments, observed under light and dark conditions, supports a genuine and manifest difference in NCEs generated by native and non-native predator presence. The energetic cost of this elevated refuge use is itself a meaningful NCE, but the behaviour may simultaneously confer protection against direct predation. Experimental evidence that shelter reduces catfish predation on crayfish</w:t>
+      </w:r>
+      <w:r>
+        <w:t xml:space="preserve"> </w:t>
+      </w:r>
+      <w:r>
+        <w:t xml:space="preserve">(ADAMS, 2007; Zhao et al., 2024)</w:t>
+      </w:r>
+      <w:r>
+        <w:t xml:space="preserve"> </w:t>
+      </w:r>
+      <w:r>
+        <w:t xml:space="preserve">raises the possibility that providing or restoring refuge habitat in catfish-invaded lakes could be a practical management tool to reduce kōura vulnerability, though direct experimental testing in field conditions would be needed to confirm this.</w:t>
+      </w:r>
+    </w:p>
+    <w:p>
+      <w:pPr>
+        <w:pStyle w:val="BodyText"/>
+      </w:pPr>
+      <w:r>
+        <w:t xml:space="preserve">In contrast to catfish exposure, kōura reduced their refuge use when exposed to eels. This likely reflects the co-evolutionary history the two species share, as kōura are able to recognise eel chemical and visual cues and respond in an appropriate rather than precautionary way</w:t>
+      </w:r>
+      <w:r>
+        <w:t xml:space="preserve"> </w:t>
+      </w:r>
+      <w:r>
+        <w:t xml:space="preserve">(Shave et al., 1994)</w:t>
+      </w:r>
+      <w:r>
+        <w:t xml:space="preserve">. Instead of hiding, kōura may rely on contextual information, such as predator size, movement patterns, or chemical concentrations, to modulate their response</w:t>
+      </w:r>
+      <w:r>
+        <w:t xml:space="preserve"> </w:t>
+      </w:r>
+      <w:r>
+        <w:t xml:space="preserve">(Wood &amp; Moore, 2020a)</w:t>
+      </w:r>
+      <w:r>
+        <w:t xml:space="preserve">. This pattern was most pronounced in the dark conditions, where all three treatments began similarly but changed progressively over the course of the experiment with catfish treatment steadily increasing in refuge use, while eel treatment stayed alongside the control, declining to baseline levels by the end of the during period. This suggests that under conditions most relevant to kōura natural activity, chemical recognition of the familiar eel predator is sufficient to enable a calibrated, low-cost response, while the unfamiliar catfish continues to elicit sustained precautionary refuge use</w:t>
+      </w:r>
+      <w:r>
+        <w:t xml:space="preserve"> </w:t>
+      </w:r>
+      <w:r>
+        <w:t xml:space="preserve">(Shave et al., 1994; Wood &amp; Moore, 2020b)</w:t>
+      </w:r>
+      <w:r>
+        <w:t xml:space="preserve">. Beyond predator recognition, one possibility is that our artificial refuges offer limited protection against eels, which can pursue prey into very confined spaces, making active avoidance and chela display a more effective strategy than sheltering</w:t>
+      </w:r>
+      <w:r>
+        <w:t xml:space="preserve"> </w:t>
+      </w:r>
+      <w:r>
+        <w:t xml:space="preserve">(Shave et al., 1994)</w:t>
+      </w:r>
+      <w:r>
+        <w:t xml:space="preserve">.</w:t>
+      </w:r>
+    </w:p>
+    <w:p>
+      <w:pPr>
+        <w:pStyle w:val="BodyText"/>
+      </w:pPr>
+      <w:r>
+        <w:t xml:space="preserve">The feeding experiment which unlike the refuge-use experiment, relied purely on non-visual cues, did not demonstrate a clear fish predator NCE on kōura. This may have been due to the concentration of predator kairomones not being high enough to exceed detection thresholds</w:t>
+      </w:r>
+      <w:r>
+        <w:t xml:space="preserve"> </w:t>
+      </w:r>
+      <w:r>
+        <w:t xml:space="preserve">(G. E. Brown et al., 2004)</w:t>
+      </w:r>
+      <w:r>
+        <w:t xml:space="preserve">, the relatively short pre-experiment starvation period for kōura and the restricted time frame of the experiment or a combination of all three factors. Kōura can readily detect necrotic fish tissue and readily leave refuges to scavenge on catfish, eel, and marine fish carcasses with little discrimination between fish species, indicating that chemosensory responses in kōura may depend on cue type, context, and concentration rather than predator identity alone</w:t>
+      </w:r>
+      <w:r>
+        <w:t xml:space="preserve"> </w:t>
+      </w:r>
+      <w:r>
+        <w:t xml:space="preserve">(MacNeil et al., 2025)</w:t>
+      </w:r>
+      <w:r>
+        <w:t xml:space="preserve">. The concentration of live fish exudates in our experiment may not reflect natural conditions where kōura and fish predators coexist, and higher concentrations may be required to elicit a detectable feeding suppression response</w:t>
+      </w:r>
+      <w:r>
+        <w:t xml:space="preserve"> </w:t>
+      </w:r>
+      <w:r>
+        <w:t xml:space="preserve">(Achtymichuk et al., 2025)</w:t>
+      </w:r>
+      <w:r>
+        <w:t xml:space="preserve">. In addition, many crayfishes show a stronger response to alarm cues of conspecifics</w:t>
+      </w:r>
+      <w:r>
+        <w:t xml:space="preserve"> </w:t>
+      </w:r>
+      <w:r>
+        <w:t xml:space="preserve">(Gherardi et al., 2011; Ramberg-Pihl &amp; Yurewicz, 2020; Stebbing et al., 2010)</w:t>
+      </w:r>
+      <w:r>
+        <w:t xml:space="preserve">, and to kairomones from predators on a conspecifics diet</w:t>
+      </w:r>
+      <w:r>
+        <w:t xml:space="preserve"> </w:t>
+      </w:r>
+      <w:r>
+        <w:t xml:space="preserve">(Beattie &amp; Moore, 2018)</w:t>
+      </w:r>
+      <w:r>
+        <w:t xml:space="preserve">. Fish predators in our experiments were kept for a prolonged period on the same diet as kōura, which may have further diminished or blunted the threatening nature of signals received from kairomones. In addition, the pre-experiment starvation period for kōura may have been insufficient to elicit a very strong feeding response, as crayfish such as kōura are opportunistic predators which are necessarily adapted to going for prolonged periods without feeding</w:t>
+      </w:r>
+      <w:r>
+        <w:t xml:space="preserve"> </w:t>
+      </w:r>
+      <w:r>
+        <w:t xml:space="preserve">(Hazlett, 2003)</w:t>
+      </w:r>
+      <w:r>
+        <w:t xml:space="preserve">. The length of time since feeding can influence foraging behaviour, with previous studies indicating that crayfish will be more active foragers after being starved for at least 3 days</w:t>
+      </w:r>
+      <w:r>
+        <w:t xml:space="preserve"> </w:t>
+      </w:r>
+      <w:r>
+        <w:t xml:space="preserve">(Hazlett, 2003)</w:t>
+      </w:r>
+      <w:r>
+        <w:t xml:space="preserve">. In the current study, the longest starvation period was 4 days and at this point there was a clear discrepancy between the control feeding rate and the much lower feeding rates in the two fish treatments. Allowing for ethics and welfare concerns, if we had extended the starvation period, this may have elicited a stronger and prolonged response. Another potential issue could be as feeding in this study was measured as a single endpoint after 24 hours, this provided no information on whether kōura initially suppressed feeding after immediate exposure to kairomones, before eventually resuming normal feeding activities</w:t>
+      </w:r>
+      <w:r>
+        <w:t xml:space="preserve"> </w:t>
+      </w:r>
+      <w:r>
+        <w:t xml:space="preserve">(Wright et al., 2010)</w:t>
+      </w:r>
+      <w:r>
+        <w:t xml:space="preserve">. Further experiments addressing these various issues may clarify whether these non-visual cues manifest as NCE’s on kōura feeding.</w:t>
+      </w:r>
+    </w:p>
+    <w:bookmarkStart w:id="17" w:name="conclusion"/>
     <w:p>
       <w:pPr>
         <w:pStyle w:val="Heading2"/>
       </w:pPr>
       <w:r>
-        <w:t xml:space="preserve">Refuge experiment</w:t>
-      </w:r>
-    </w:p>
-    <w:bookmarkEnd w:id="29"/>
-    <w:bookmarkStart w:id="30" w:name="feeding-experiment-2"/>
-    <w:p>
-      <w:pPr>
-        <w:pStyle w:val="Heading2"/>
-      </w:pPr>
-      <w:r>
-        <w:t xml:space="preserve">Feeding experiment</w:t>
-      </w:r>
-    </w:p>
-    <w:bookmarkEnd w:id="30"/>
-    <w:bookmarkStart w:id="31" w:name="conclusion"/>
-    <w:p>
-      <w:pPr>
-        <w:pStyle w:val="Heading2"/>
-      </w:pPr>
-      <w:r>
         <w:t xml:space="preserve">Conclusion</w:t>
       </w:r>
     </w:p>
-    <w:bookmarkEnd w:id="31"/>
-    <w:bookmarkEnd w:id="32"/>
-    <w:bookmarkStart w:id="33" w:name="acknowledgements"/>
+    <w:p>
+      <w:pPr>
+        <w:pStyle w:val="FirstParagraph"/>
+      </w:pPr>
+      <w:r>
+        <w:t xml:space="preserve">This study provides experimental evidence that the invasive brown bullhead catfish exerts stronger NCEs on the native freshwater crayfish kōura, evidenced by significantly greater refuge-seeking behaviour than the co-evolved native longfin eel. The heightened response to the novel catfish could reflect a generalised antipredator response triggered by unfamiliar chemical and visual cues, consistent with a fear generalisation framework. In contrast, the reduced response to eels suggests that co-evolutionary experience may have enabled kōura to make more calibrated risk assessments and adjusted refuge use accordingly. Further comparative studies of kōura sourced from catfish invaded freshwaters as well as catfish absent areas would be worthwhile, to assess if catfish ‘experienced’ kōura react differently than catfish-naive kōura, when presented with the same catfish predator threat. If this was the case and despite catfish being only present in Aotearoa for two centuries, it could present the possibility of ‘teaching’ naive kōura to adjust their behaviour in an appropriate and proportionate way to catfish presence, by exposing selected naive populations to catfish under controlled laboratory conditions, before an actual catfish invasion event occurs. Although we found no significant NCE of fish exudates on feeding behaviour, our study suggests further investigations of such non-visual cues are warranted in this area. Because kōura are keystone species and ecosystem engineers, even a small increase in refuge use driven by catfish presence could have cascading effects on sediment dynamics, decomposition, and nutrient cycling in invaded lakes. As brown bullhead catfish continue to spread across Aotearoa’s rivers and lakes, management strategies aimed at protecting kōura should account for the behavioural cost of catfish NCEs alongside direct predation pressure as a, so far, underappreciated and ecologically significant dimension to this invasion.</w:t>
+      </w:r>
+    </w:p>
+    <w:bookmarkEnd w:id="17"/>
+    <w:bookmarkEnd w:id="18"/>
+    <w:bookmarkStart w:id="19" w:name="acknowledgements"/>
     <w:p>
       <w:pPr>
         <w:pStyle w:val="Heading1"/>
@@ -727,28 +1158,98 @@
         <w:t xml:space="preserve">Acknowledgements</w:t>
       </w:r>
     </w:p>
-    <w:bookmarkEnd w:id="33"/>
-    <w:bookmarkStart w:id="34" w:name="references"/>
+    <w:p>
+      <w:pPr>
+        <w:pStyle w:val="FirstParagraph"/>
+      </w:pPr>
+      <w:r>
+        <w:t xml:space="preserve">We thank Te Arawa Lakes Trust and Te Komiti Whakahaere for the opportunity to collect and study the treasured kōura. We are grateful to Soweeta Fort-D’ath and William Anaru (Te Arawa Lakes Trust), and Tihini Grant (Ngāti Pikiao). We also thank Nick Ling and Ben Roche (University of Waikato) for assisting with catfish and eel collection. This research was supported by the Fish Futures programme funded through a Ministry of Business, Innovation and Employment grant (CAWX2101).</w:t>
+      </w:r>
+    </w:p>
+    <w:bookmarkEnd w:id="19"/>
+    <w:bookmarkStart w:id="20" w:name="authors-contributions"/>
     <w:p>
       <w:pPr>
         <w:pStyle w:val="Heading1"/>
       </w:pPr>
       <w:r>
+        <w:t xml:space="preserve">Authors’ contributions</w:t>
+      </w:r>
+    </w:p>
+    <w:p>
+      <w:pPr>
+        <w:pStyle w:val="FirstParagraph"/>
+      </w:pPr>
+      <w:r>
+        <w:t xml:space="preserve">Study conception and design were undertaken by O.V.R, C.M. and R.H. Experiments were executed by O.V. R and C.M. Data analysis was performed by F. L. and O.V.R. Local ecological knowledge was contributed by I.A.K.K. Manuscript drafting was led by O.V.R. and C.M. All authors contributed to manuscript revision, approved the results, and the final manuscript.</w:t>
+      </w:r>
+    </w:p>
+    <w:bookmarkEnd w:id="20"/>
+    <w:bookmarkStart w:id="21" w:name="ethical-approval"/>
+    <w:p>
+      <w:pPr>
+        <w:pStyle w:val="Heading1"/>
+      </w:pPr>
+      <w:r>
+        <w:t xml:space="preserve">Ethical approval</w:t>
+      </w:r>
+    </w:p>
+    <w:p>
+      <w:pPr>
+        <w:pStyle w:val="FirstParagraph"/>
+      </w:pPr>
+      <w:r>
+        <w:t xml:space="preserve">This study received ethical approval by University of Waikato animal ethics committee, protocol number: 1232. Additional permission to conduct experiments with kōura was granted by Te Arawa Lakes Trust and Te Komiti Whakahaere.</w:t>
+      </w:r>
+    </w:p>
+    <w:bookmarkEnd w:id="21"/>
+    <w:bookmarkStart w:id="22" w:name="declarations"/>
+    <w:p>
+      <w:pPr>
+        <w:pStyle w:val="Heading1"/>
+      </w:pPr>
+      <w:r>
+        <w:t xml:space="preserve">Declarations</w:t>
+      </w:r>
+    </w:p>
+    <w:p>
+      <w:pPr>
+        <w:pStyle w:val="FirstParagraph"/>
+      </w:pPr>
+      <w:r>
+        <w:t xml:space="preserve">The corresponding author has declared that none of the authors has any competing interests.</w:t>
+      </w:r>
+    </w:p>
+    <w:bookmarkEnd w:id="22"/>
+    <w:bookmarkStart w:id="23" w:name="data-availability-statement"/>
+    <w:p>
+      <w:pPr>
+        <w:pStyle w:val="Heading1"/>
+      </w:pPr>
+      <w:r>
+        <w:t xml:space="preserve">Data availability statement</w:t>
+      </w:r>
+    </w:p>
+    <w:p>
+      <w:pPr>
+        <w:pStyle w:val="FirstParagraph"/>
+      </w:pPr>
+      <w:r>
+        <w:t xml:space="preserve">The code and data supporting the findings of this study are openly available on Zenodo (add link) and GitHub https://github.com/OlivierRaven/NCE_Koura_catfish.</w:t>
+      </w:r>
+    </w:p>
+    <w:bookmarkEnd w:id="23"/>
+    <w:bookmarkStart w:id="24" w:name="references"/>
+    <w:p>
+      <w:pPr>
+        <w:pStyle w:val="Heading1"/>
+      </w:pPr>
+      <w:r>
         <w:t xml:space="preserve">References</w:t>
       </w:r>
     </w:p>
-    <w:bookmarkEnd w:id="34"/>
-    <w:bookmarkStart w:id="35" w:name="tables"/>
-    <w:p>
-      <w:pPr>
-        <w:pStyle w:val="Heading1"/>
-      </w:pPr>
-      <w:r>
-        <w:t xml:space="preserve">Tables</w:t>
-      </w:r>
-    </w:p>
-    <w:bookmarkEnd w:id="35"/>
-    <w:bookmarkStart w:id="55" w:name="figures"/>
+    <w:bookmarkEnd w:id="24"/>
+    <w:bookmarkStart w:id="44" w:name="figures"/>
     <w:p>
       <w:pPr>
         <w:pStyle w:val="Heading1"/>
@@ -770,7 +1271,7 @@
       <w:tr>
         <w:tc>
           <w:tcPr/>
-          <w:bookmarkStart w:id="39" w:name="fig-aquarium-setup"/>
+          <w:bookmarkStart w:id="28" w:name="fig-aquarium-setup"/>
           <w:p>
             <w:pPr>
               <w:pStyle w:val="Compact"/>
@@ -779,20 +1280,20 @@
             <w:r>
               <w:drawing>
                 <wp:inline>
-                  <wp:extent cx="5727700" cy="1823231"/>
+                  <wp:extent cx="5727700" cy="4480989"/>
                   <wp:effectExtent b="0" l="0" r="0" t="0"/>
-                  <wp:docPr descr="" title="" id="37" name="Picture"/>
+                  <wp:docPr descr="" title="" id="26" name="Picture"/>
                   <a:graphic>
                     <a:graphicData uri="http://schemas.openxmlformats.org/drawingml/2006/picture">
                       <pic:pic>
                         <pic:nvPicPr>
-                          <pic:cNvPr descr="images/aquarium_setup.png" id="38" name="Picture"/>
+                          <pic:cNvPr descr="images/setup_combined.png" id="27" name="Picture"/>
                           <pic:cNvPicPr>
                             <a:picLocks noChangeArrowheads="1" noChangeAspect="1"/>
                           </pic:cNvPicPr>
                         </pic:nvPicPr>
                         <pic:blipFill>
-                          <a:blip r:embed="rId36"/>
+                          <a:blip r:embed="rId25"/>
                           <a:stretch>
                             <a:fillRect/>
                           </a:stretch>
@@ -800,7 +1301,7 @@
                         <pic:spPr bwMode="auto">
                           <a:xfrm>
                             <a:off x="0" y="0"/>
-                            <a:ext cx="5727700" cy="1823231"/>
+                            <a:ext cx="5727700" cy="4480989"/>
                           </a:xfrm>
                           <a:prstGeom prst="rect">
                             <a:avLst/>
@@ -829,10 +1330,10 @@
               <w:pStyle w:val="ImageCaption"/>
             </w:pPr>
             <w:r>
-              <w:t xml:space="preserve">Figure 1: Schematic overview of the experimental aquarium layout for one experimental round. Eight aquaria were run simultaneously. In each tank, a single kōura (K) was housed on one side of the aquarium with a shelter, while a predator (catfish (C) or eel (E)) or no predator (control) was placed on the opposite side behind a mesh divider allowing visual and chemical cues but preventing physical contact.</w:t>
+              <w:t xml:space="preserve">Figure 1: (a) Aquarium layout for kōura refuge seeking behaviour experiment. Each experimental round consisted of eight aquaria run simultaneously. Each tank contained a single kōura (K) and refuge (half terracotta plant pot) on one side of a mesh divider. On the other side was either a single catfish (C), eel (E) or a control (C) with no fish. The mesh divider allowed visual and chemical cues while preventing direct physical contact between tank occupants. (b) Experiments were repeated in light and dark (red light), with photographs showing a catfish in the light regime (left) and and an eel in the dark regime (red light) (right) separated from kōura by mesh dividers.</w:t>
             </w:r>
           </w:p>
-          <w:bookmarkEnd w:id="39"/>
+          <w:bookmarkEnd w:id="28"/>
         </w:tc>
       </w:tr>
     </w:tbl>
@@ -860,7 +1361,7 @@
       <w:tr>
         <w:tc>
           <w:tcPr/>
-          <w:bookmarkStart w:id="43" w:name="fig-refuge-plot"/>
+          <w:bookmarkStart w:id="32" w:name="fig-refuge-plot"/>
           <w:p>
             <w:pPr>
               <w:pStyle w:val="Compact"/>
@@ -871,18 +1372,18 @@
                 <wp:inline>
                   <wp:extent cx="5727700" cy="4295775"/>
                   <wp:effectExtent b="0" l="0" r="0" t="0"/>
-                  <wp:docPr descr="" title="" id="41" name="Picture"/>
+                  <wp:docPr descr="" title="" id="30" name="Picture"/>
                   <a:graphic>
                     <a:graphicData uri="http://schemas.openxmlformats.org/drawingml/2006/picture">
                       <pic:pic>
                         <pic:nvPicPr>
-                          <pic:cNvPr descr="index_files/figure-docx/analysis-fig-refuge-plot-output-2.png" id="42" name="Picture"/>
+                          <pic:cNvPr descr="index_files/figure-docx/analysis-fig-refuge-plot-output-2.png" id="31" name="Picture"/>
                           <pic:cNvPicPr>
                             <a:picLocks noChangeArrowheads="1" noChangeAspect="1"/>
                           </pic:cNvPicPr>
                         </pic:nvPicPr>
                         <pic:blipFill>
-                          <a:blip r:embed="rId40"/>
+                          <a:blip r:embed="rId29"/>
                           <a:stretch>
                             <a:fillRect/>
                           </a:stretch>
@@ -922,7 +1423,7 @@
               <w:t xml:space="preserve">Figure 2: Kōura use of refuge over course of experiment with the three periods (before, during, after), the treatment (catfish; red-solid circle, eel; green-dashed triangle, control; blue-dotdash square), and divided over light regime (combined, dark, light). The points represent the proportion within each period for each treatment.</w:t>
             </w:r>
           </w:p>
-          <w:bookmarkEnd w:id="43"/>
+          <w:bookmarkEnd w:id="32"/>
         </w:tc>
       </w:tr>
     </w:tbl>
@@ -942,7 +1443,7 @@
         </w:rPr>
         <w:t xml:space="preserve"> </w:t>
       </w:r>
-      <w:hyperlink r:id="rId44">
+      <w:hyperlink r:id="rId33">
         <w:r>
           <w:rPr>
             <w:rStyle w:val="Hyperlink"/>
@@ -965,7 +1466,7 @@
       <w:tr>
         <w:tc>
           <w:tcPr/>
-          <w:bookmarkStart w:id="48" w:name="fig-emmeans-plot"/>
+          <w:bookmarkStart w:id="37" w:name="fig-emmeans-plot"/>
           <w:p>
             <w:pPr>
               <w:pStyle w:val="Compact"/>
@@ -976,18 +1477,18 @@
                 <wp:inline>
                   <wp:extent cx="5727700" cy="4295775"/>
                   <wp:effectExtent b="0" l="0" r="0" t="0"/>
-                  <wp:docPr descr="" title="" id="46" name="Picture"/>
+                  <wp:docPr descr="" title="" id="35" name="Picture"/>
                   <a:graphic>
                     <a:graphicData uri="http://schemas.openxmlformats.org/drawingml/2006/picture">
                       <pic:pic>
                         <pic:nvPicPr>
-                          <pic:cNvPr descr="index_files/figure-docx/analysis-fig-emmeans-plot-output-1.png" id="47" name="Picture"/>
+                          <pic:cNvPr descr="index_files/figure-docx/analysis-fig-emmeans-plot-output-1.png" id="36" name="Picture"/>
                           <pic:cNvPicPr>
                             <a:picLocks noChangeArrowheads="1" noChangeAspect="1"/>
                           </pic:cNvPicPr>
                         </pic:nvPicPr>
                         <pic:blipFill>
-                          <a:blip r:embed="rId45"/>
+                          <a:blip r:embed="rId34"/>
                           <a:stretch>
                             <a:fillRect/>
                           </a:stretch>
@@ -1024,10 +1525,10 @@
               <w:pStyle w:val="ImageCaption"/>
             </w:pPr>
             <w:r>
-              <w:t xml:space="preserve">Figure 3: Predicted marginal probabilities of refuge use from the beta-binomial GLMM for each level of treatment, light condition, and experimental period. Points represent model-estimated marginal means averaged over other factors, with 95% confidence intervals shown as error bars. Different letters (a, b) indicate statistically significant differences between groups within each factor based on Tukey-adjusted pairwise comparisons. The dashed line at 0.5 marks the threshold where kōura spend half their time in refuge.</w:t>
+              <w:t xml:space="preserve">Figure 3: Predicted marginal probabilities of refuge use from the beta-binomial GLMM for each level of treatment, light condition, and experimental period. Points represent model-estimated marginal means averaged over other factors, with 95% confidence intervals shown as error bars. Different letters (a, b) indicate statistically significant differences between groups within each factor based on multiple comparison-adjusted pairwise comparisons. The dashed line at 0.5 marks the threshold where kōura spend half their time in refuge.</w:t>
             </w:r>
           </w:p>
-          <w:bookmarkEnd w:id="48"/>
+          <w:bookmarkEnd w:id="37"/>
         </w:tc>
       </w:tr>
     </w:tbl>
@@ -1047,7 +1548,7 @@
         </w:rPr>
         <w:t xml:space="preserve"> </w:t>
       </w:r>
-      <w:hyperlink r:id="rId49">
+      <w:hyperlink r:id="rId38">
         <w:r>
           <w:rPr>
             <w:rStyle w:val="Hyperlink"/>
@@ -1070,7 +1571,7 @@
       <w:tr>
         <w:tc>
           <w:tcPr/>
-          <w:bookmarkStart w:id="53" w:name="fig-feeding-plot"/>
+          <w:bookmarkStart w:id="42" w:name="fig-feeding-plot"/>
           <w:p>
             <w:pPr>
               <w:pStyle w:val="Compact"/>
@@ -1081,18 +1582,18 @@
                 <wp:inline>
                   <wp:extent cx="5727700" cy="4295775"/>
                   <wp:effectExtent b="0" l="0" r="0" t="0"/>
-                  <wp:docPr descr="" title="" id="51" name="Picture"/>
+                  <wp:docPr descr="" title="" id="40" name="Picture"/>
                   <a:graphic>
                     <a:graphicData uri="http://schemas.openxmlformats.org/drawingml/2006/picture">
                       <pic:pic>
                         <pic:nvPicPr>
-                          <pic:cNvPr descr="index_files/figure-docx/analysis-fig-feeding-plot-output-1.png" id="52" name="Picture"/>
+                          <pic:cNvPr descr="index_files/figure-docx/analysis-fig-feeding-plot-output-1.png" id="41" name="Picture"/>
                           <pic:cNvPicPr>
                             <a:picLocks noChangeArrowheads="1" noChangeAspect="1"/>
                           </pic:cNvPicPr>
                         </pic:nvPicPr>
                         <pic:blipFill>
-                          <a:blip r:embed="rId50"/>
+                          <a:blip r:embed="rId39"/>
                           <a:stretch>
                             <a:fillRect/>
                           </a:stretch>
@@ -1132,7 +1633,7 @@
               <w:t xml:space="preserve">Figure 4: Mean kōura feeding rate (pellets consumed per gram body weight ± SE) across predator treatments (catfish, eel, control) and starvation periods (0, 3, and 4 days). Points represent treatment means and error bars show standard error.</w:t>
             </w:r>
           </w:p>
-          <w:bookmarkEnd w:id="53"/>
+          <w:bookmarkEnd w:id="42"/>
         </w:tc>
       </w:tr>
     </w:tbl>
@@ -1152,7 +1653,7 @@
         </w:rPr>
         <w:t xml:space="preserve"> </w:t>
       </w:r>
-      <w:hyperlink r:id="rId54">
+      <w:hyperlink r:id="rId43">
         <w:r>
           <w:rPr>
             <w:rStyle w:val="Hyperlink"/>
@@ -1162,8 +1663,8 @@
         </w:r>
       </w:hyperlink>
     </w:p>
-    <w:bookmarkEnd w:id="55"/>
-    <w:bookmarkStart w:id="64" w:name="supplementary-information"/>
+    <w:bookmarkEnd w:id="44"/>
+    <w:bookmarkStart w:id="152" w:name="supplementary-information"/>
     <w:p>
       <w:pPr>
         <w:pStyle w:val="Heading1"/>
@@ -1185,7 +1686,7 @@
       <w:tr>
         <w:tc>
           <w:tcPr/>
-          <w:bookmarkStart w:id="56" w:name="tbl-s1-refuge-prop"/>
+          <w:bookmarkStart w:id="45" w:name="tbl-s1-refuge-prop"/>
           <w:p>
             <w:pPr>
               <w:jc w:val="center"/>
@@ -1211,7 +1712,7 @@
               <w:t xml:space="preserve">Unable to display output for mime type(s): text/html</w:t>
             </w:r>
           </w:p>
-          <w:bookmarkEnd w:id="56"/>
+          <w:bookmarkEnd w:id="45"/>
         </w:tc>
       </w:tr>
     </w:tbl>
@@ -1231,7 +1732,7 @@
         </w:rPr>
         <w:t xml:space="preserve"> </w:t>
       </w:r>
-      <w:hyperlink r:id="rId57">
+      <w:hyperlink r:id="rId46">
         <w:r>
           <w:rPr>
             <w:rStyle w:val="Hyperlink"/>
@@ -1254,7 +1755,7 @@
       <w:tr>
         <w:tc>
           <w:tcPr/>
-          <w:bookmarkStart w:id="58" w:name="tbl-s2-fixed-effects"/>
+          <w:bookmarkStart w:id="47" w:name="tbl-s2-fixed-effects"/>
           <w:p>
             <w:pPr>
               <w:jc w:val="center"/>
@@ -1754,7 +2255,7 @@
               </w:tc>
             </w:tr>
           </w:tbl>
-          <w:bookmarkEnd w:id="58"/>
+          <w:bookmarkEnd w:id="47"/>
           <w:p/>
         </w:tc>
       </w:tr>
@@ -1775,7 +2276,7 @@
         </w:rPr>
         <w:t xml:space="preserve"> </w:t>
       </w:r>
-      <w:hyperlink r:id="rId59">
+      <w:hyperlink r:id="rId48">
         <w:r>
           <w:rPr>
             <w:rStyle w:val="Hyperlink"/>
@@ -1798,7 +2299,7 @@
       <w:tr>
         <w:tc>
           <w:tcPr/>
-          <w:bookmarkStart w:id="60" w:name="tbl-s3-emmeans"/>
+          <w:bookmarkStart w:id="49" w:name="tbl-s3-emmeans"/>
           <w:p>
             <w:pPr>
               <w:jc w:val="center"/>
@@ -2681,7 +3182,7 @@
               </w:tc>
             </w:tr>
           </w:tbl>
-          <w:bookmarkEnd w:id="60"/>
+          <w:bookmarkEnd w:id="49"/>
           <w:p/>
         </w:tc>
       </w:tr>
@@ -2702,7 +3203,7 @@
         </w:rPr>
         <w:t xml:space="preserve"> </w:t>
       </w:r>
-      <w:hyperlink r:id="rId61">
+      <w:hyperlink r:id="rId50">
         <w:r>
           <w:rPr>
             <w:rStyle w:val="Hyperlink"/>
@@ -2725,7 +3226,7 @@
       <w:tr>
         <w:tc>
           <w:tcPr/>
-          <w:bookmarkStart w:id="62" w:name="tbl-s4-feeding-anova"/>
+          <w:bookmarkStart w:id="51" w:name="tbl-s4-feeding-anova"/>
           <w:p>
             <w:pPr>
               <w:jc w:val="center"/>
@@ -3158,7 +3659,7 @@
               </w:tc>
             </w:tr>
           </w:tbl>
-          <w:bookmarkEnd w:id="62"/>
+          <w:bookmarkEnd w:id="51"/>
           <w:p/>
         </w:tc>
       </w:tr>
@@ -3179,7 +3680,7 @@
         </w:rPr>
         <w:t xml:space="preserve"> </w:t>
       </w:r>
-      <w:hyperlink r:id="rId63">
+      <w:hyperlink r:id="rId52">
         <w:r>
           <w:rPr>
             <w:rStyle w:val="Hyperlink"/>
@@ -3189,7 +3690,2248 @@
         </w:r>
       </w:hyperlink>
     </w:p>
+    <w:bookmarkStart w:id="151" w:name="refs"/>
+    <w:bookmarkStart w:id="54" w:name="ref-Abrams2000"/>
+    <w:p>
+      <w:pPr>
+        <w:pStyle w:val="Bibliography"/>
+      </w:pPr>
+      <w:r>
+        <w:t xml:space="preserve">Abrams, P. A. (2000). The evolution of predator-prey interactions: Theory and evidence.</w:t>
+      </w:r>
+      <w:r>
+        <w:t xml:space="preserve"> </w:t>
+      </w:r>
+      <w:r>
+        <w:rPr>
+          <w:i/>
+          <w:iCs/>
+        </w:rPr>
+        <w:t xml:space="preserve">Annual Review of Ecology and Systematics</w:t>
+      </w:r>
+      <w:r>
+        <w:t xml:space="preserve">,</w:t>
+      </w:r>
+      <w:r>
+        <w:t xml:space="preserve"> </w:t>
+      </w:r>
+      <w:r>
+        <w:rPr>
+          <w:i/>
+          <w:iCs/>
+        </w:rPr>
+        <w:t xml:space="preserve">31</w:t>
+      </w:r>
+      <w:r>
+        <w:t xml:space="preserve">(1), 79–105.</w:t>
+      </w:r>
+      <w:r>
+        <w:t xml:space="preserve"> </w:t>
+      </w:r>
+      <w:hyperlink r:id="rId53">
+        <w:r>
+          <w:rPr>
+            <w:rStyle w:val="Hyperlink"/>
+          </w:rPr>
+          <w:t xml:space="preserve">https://doi.org/10.1146/annurev.ecolsys.31.1.79</w:t>
+        </w:r>
+      </w:hyperlink>
+    </w:p>
+    <w:bookmarkEnd w:id="54"/>
+    <w:bookmarkStart w:id="56" w:name="ref-Achtymichuk2025"/>
+    <w:p>
+      <w:pPr>
+        <w:pStyle w:val="Bibliography"/>
+      </w:pPr>
+      <w:r>
+        <w:t xml:space="preserve">Achtymichuk, G. H., Fish, K. M., &amp; Ferrari, M. C. O. (2025). The power of concentration: Antipredator responses to diluted frozen crayfish alarm cues provide insights on ecologically relevant concentrations and updates to methodology.</w:t>
+      </w:r>
+      <w:r>
+        <w:t xml:space="preserve"> </w:t>
+      </w:r>
+      <w:r>
+        <w:rPr>
+          <w:i/>
+          <w:iCs/>
+        </w:rPr>
+        <w:t xml:space="preserve">PLOS One</w:t>
+      </w:r>
+      <w:r>
+        <w:t xml:space="preserve">,</w:t>
+      </w:r>
+      <w:r>
+        <w:t xml:space="preserve"> </w:t>
+      </w:r>
+      <w:r>
+        <w:rPr>
+          <w:i/>
+          <w:iCs/>
+        </w:rPr>
+        <w:t xml:space="preserve">20</w:t>
+      </w:r>
+      <w:r>
+        <w:t xml:space="preserve">(12), e0340001.</w:t>
+      </w:r>
+      <w:r>
+        <w:t xml:space="preserve"> </w:t>
+      </w:r>
+      <w:hyperlink r:id="rId55">
+        <w:r>
+          <w:rPr>
+            <w:rStyle w:val="Hyperlink"/>
+          </w:rPr>
+          <w:t xml:space="preserve">https://doi.org/10.1371/journal.pone.0340001</w:t>
+        </w:r>
+      </w:hyperlink>
+    </w:p>
+    <w:bookmarkEnd w:id="56"/>
+    <w:bookmarkStart w:id="58" w:name="ref-Adams2007"/>
+    <w:p>
+      <w:pPr>
+        <w:pStyle w:val="Bibliography"/>
+      </w:pPr>
+      <w:r>
+        <w:t xml:space="preserve">ADAMS, S. B. (2007). Direct and indirect effects of channel catfish (ictalurus punctatus) on native crayfishes (cambaridae) in experimental tanks.</w:t>
+      </w:r>
+      <w:r>
+        <w:t xml:space="preserve"> </w:t>
+      </w:r>
+      <w:r>
+        <w:rPr>
+          <w:i/>
+          <w:iCs/>
+        </w:rPr>
+        <w:t xml:space="preserve">The American Midland Naturalist</w:t>
+      </w:r>
+      <w:r>
+        <w:t xml:space="preserve">,</w:t>
+      </w:r>
+      <w:r>
+        <w:t xml:space="preserve"> </w:t>
+      </w:r>
+      <w:r>
+        <w:rPr>
+          <w:i/>
+          <w:iCs/>
+        </w:rPr>
+        <w:t xml:space="preserve">158</w:t>
+      </w:r>
+      <w:r>
+        <w:t xml:space="preserve">(1), 85–96.</w:t>
+      </w:r>
+      <w:r>
+        <w:t xml:space="preserve"> </w:t>
+      </w:r>
+      <w:hyperlink r:id="rId57">
+        <w:r>
+          <w:rPr>
+            <w:rStyle w:val="Hyperlink"/>
+          </w:rPr>
+          <w:t xml:space="preserve">https://doi.org/10.1674/0003-0031(2007)158[85:daieoc]2.0.co;2</w:t>
+        </w:r>
+      </w:hyperlink>
+    </w:p>
+    <w:bookmarkEnd w:id="58"/>
+    <w:bookmarkStart w:id="59" w:name="ref-Barnes2003"/>
+    <w:p>
+      <w:pPr>
+        <w:pStyle w:val="Bibliography"/>
+      </w:pPr>
+      <w:r>
+        <w:t xml:space="preserve">Barnes, G. E., &amp; Hicks, B. J. (2003).</w:t>
+      </w:r>
+      <w:r>
+        <w:t xml:space="preserve"> </w:t>
+      </w:r>
+      <w:r>
+        <w:rPr>
+          <w:i/>
+          <w:iCs/>
+        </w:rPr>
+        <w:t xml:space="preserve">Brown bullhead catfish (ameiurus nebulosus) in lake taupo (managing invasive freshwater fish in new zealand)</w:t>
+      </w:r>
+      <w:r>
+        <w:t xml:space="preserve">. Department of Conservation.</w:t>
+      </w:r>
+    </w:p>
+    <w:bookmarkEnd w:id="59"/>
+    <w:bookmarkStart w:id="61" w:name="ref-Beattie2018"/>
+    <w:p>
+      <w:pPr>
+        <w:pStyle w:val="Bibliography"/>
+      </w:pPr>
+      <w:r>
+        <w:t xml:space="preserve">Beattie, M. C., &amp; Moore, P. A. (2018). Predator recognition of chemical cues in crayfish: Diet and experience influence the ability to detect predation threats.</w:t>
+      </w:r>
+      <w:r>
+        <w:t xml:space="preserve"> </w:t>
+      </w:r>
+      <w:r>
+        <w:rPr>
+          <w:i/>
+          <w:iCs/>
+        </w:rPr>
+        <w:t xml:space="preserve">Behaviour</w:t>
+      </w:r>
+      <w:r>
+        <w:t xml:space="preserve">,</w:t>
+      </w:r>
+      <w:r>
+        <w:t xml:space="preserve"> </w:t>
+      </w:r>
+      <w:r>
+        <w:rPr>
+          <w:i/>
+          <w:iCs/>
+        </w:rPr>
+        <w:t xml:space="preserve">155</w:t>
+      </w:r>
+      <w:r>
+        <w:t xml:space="preserve">(6), 505–530.</w:t>
+      </w:r>
+      <w:r>
+        <w:t xml:space="preserve"> </w:t>
+      </w:r>
+      <w:hyperlink r:id="rId60">
+        <w:r>
+          <w:rPr>
+            <w:rStyle w:val="Hyperlink"/>
+          </w:rPr>
+          <w:t xml:space="preserve">https://doi.org/10.1163/1568539x-00003501</w:t>
+        </w:r>
+      </w:hyperlink>
+    </w:p>
+    <w:bookmarkEnd w:id="61"/>
+    <w:bookmarkStart w:id="63" w:name="ref-Blake1993"/>
+    <w:p>
+      <w:pPr>
+        <w:pStyle w:val="Bibliography"/>
+      </w:pPr>
+      <w:r>
+        <w:t xml:space="preserve">BLAKE, M. A., &amp; HART, P. J. B. (1993). The behavioural responses of juvenile signal crayfish pacifastacus leniusculus to stimuli from perch and eels.</w:t>
+      </w:r>
+      <w:r>
+        <w:t xml:space="preserve"> </w:t>
+      </w:r>
+      <w:r>
+        <w:rPr>
+          <w:i/>
+          <w:iCs/>
+        </w:rPr>
+        <w:t xml:space="preserve">Freshwater Biology</w:t>
+      </w:r>
+      <w:r>
+        <w:t xml:space="preserve">,</w:t>
+      </w:r>
+      <w:r>
+        <w:t xml:space="preserve"> </w:t>
+      </w:r>
+      <w:r>
+        <w:rPr>
+          <w:i/>
+          <w:iCs/>
+        </w:rPr>
+        <w:t xml:space="preserve">29</w:t>
+      </w:r>
+      <w:r>
+        <w:t xml:space="preserve">(1), 89–97.</w:t>
+      </w:r>
+      <w:r>
+        <w:t xml:space="preserve"> </w:t>
+      </w:r>
+      <w:hyperlink r:id="rId62">
+        <w:r>
+          <w:rPr>
+            <w:rStyle w:val="Hyperlink"/>
+          </w:rPr>
+          <w:t xml:space="preserve">https://doi.org/10.1111/j.1365-2427.1993.tb00747.x</w:t>
+        </w:r>
+      </w:hyperlink>
+    </w:p>
+    <w:bookmarkEnd w:id="63"/>
+    <w:bookmarkStart w:id="64" w:name="ref-Bronmark2012"/>
+    <w:p>
+      <w:pPr>
+        <w:pStyle w:val="Bibliography"/>
+      </w:pPr>
+      <w:r>
+        <w:t xml:space="preserve">Brönmark, C., &amp; Hansson, L.-A. (2012).</w:t>
+      </w:r>
+      <w:r>
+        <w:t xml:space="preserve"> </w:t>
+      </w:r>
+      <w:r>
+        <w:rPr>
+          <w:i/>
+          <w:iCs/>
+        </w:rPr>
+        <w:t xml:space="preserve">Chemical ecology in aquatic systems</w:t>
+      </w:r>
+      <w:r>
+        <w:t xml:space="preserve">. Oxford University Press.</w:t>
+      </w:r>
+    </w:p>
     <w:bookmarkEnd w:id="64"/>
+    <w:bookmarkStart w:id="66" w:name="ref-Brooks2017"/>
+    <w:p>
+      <w:pPr>
+        <w:pStyle w:val="Bibliography"/>
+      </w:pPr>
+      <w:r>
+        <w:t xml:space="preserve">Brooks, E., Mollie, Kristensen, K., Benthem, J., Koen, Magnusson, A., Berg, W., Casper, Nielsen, A., Skaug, J., Hans, Mächler, M., &amp; Bolker, M., Benjamin. (2017). glmmTMB balances speed and flexibility among packages for zero-inflated generalized linear mixed modeling.</w:t>
+      </w:r>
+      <w:r>
+        <w:t xml:space="preserve"> </w:t>
+      </w:r>
+      <w:r>
+        <w:rPr>
+          <w:i/>
+          <w:iCs/>
+        </w:rPr>
+        <w:t xml:space="preserve">The R Journal</w:t>
+      </w:r>
+      <w:r>
+        <w:t xml:space="preserve">,</w:t>
+      </w:r>
+      <w:r>
+        <w:t xml:space="preserve"> </w:t>
+      </w:r>
+      <w:r>
+        <w:rPr>
+          <w:i/>
+          <w:iCs/>
+        </w:rPr>
+        <w:t xml:space="preserve">9</w:t>
+      </w:r>
+      <w:r>
+        <w:t xml:space="preserve">(2), 378.</w:t>
+      </w:r>
+      <w:r>
+        <w:t xml:space="preserve"> </w:t>
+      </w:r>
+      <w:hyperlink r:id="rId65">
+        <w:r>
+          <w:rPr>
+            <w:rStyle w:val="Hyperlink"/>
+          </w:rPr>
+          <w:t xml:space="preserve">https://doi.org/10.32614/rj-2017-066</w:t>
+        </w:r>
+      </w:hyperlink>
+    </w:p>
+    <w:bookmarkEnd w:id="66"/>
+    <w:bookmarkStart w:id="68" w:name="ref-Brown2004"/>
+    <w:p>
+      <w:pPr>
+        <w:pStyle w:val="Bibliography"/>
+      </w:pPr>
+      <w:r>
+        <w:t xml:space="preserve">Brown, G. E., Poirier, J.-F., &amp; Adrian, J. C. (2004). Assessment of local predation risk: The role of subthreshold concentrations of chemical alarm cues.</w:t>
+      </w:r>
+      <w:r>
+        <w:t xml:space="preserve"> </w:t>
+      </w:r>
+      <w:r>
+        <w:rPr>
+          <w:i/>
+          <w:iCs/>
+        </w:rPr>
+        <w:t xml:space="preserve">Behavioral Ecology</w:t>
+      </w:r>
+      <w:r>
+        <w:t xml:space="preserve">,</w:t>
+      </w:r>
+      <w:r>
+        <w:t xml:space="preserve"> </w:t>
+      </w:r>
+      <w:r>
+        <w:rPr>
+          <w:i/>
+          <w:iCs/>
+        </w:rPr>
+        <w:t xml:space="preserve">15</w:t>
+      </w:r>
+      <w:r>
+        <w:t xml:space="preserve">(5), 810–815.</w:t>
+      </w:r>
+      <w:r>
+        <w:t xml:space="preserve"> </w:t>
+      </w:r>
+      <w:hyperlink r:id="rId67">
+        <w:r>
+          <w:rPr>
+            <w:rStyle w:val="Hyperlink"/>
+          </w:rPr>
+          <w:t xml:space="preserve">https://doi.org/10.1093/beheco/arh084</w:t>
+        </w:r>
+      </w:hyperlink>
+    </w:p>
+    <w:bookmarkEnd w:id="68"/>
+    <w:bookmarkStart w:id="70" w:name="ref-Brown2009"/>
+    <w:p>
+      <w:pPr>
+        <w:pStyle w:val="Bibliography"/>
+      </w:pPr>
+      <w:r>
+        <w:t xml:space="preserve">Brown, L. A. (2009).</w:t>
+      </w:r>
+      <w:r>
+        <w:t xml:space="preserve"> </w:t>
+      </w:r>
+      <w:r>
+        <w:rPr>
+          <w:i/>
+          <w:iCs/>
+        </w:rPr>
+        <w:t xml:space="preserve">Habitat determinants and predatory interactions of the endemic freshwater crayfish (koura, paranephrops planifrons) in the lower north island, new zealand</w:t>
+      </w:r>
+      <w:r>
+        <w:t xml:space="preserve"> </w:t>
+      </w:r>
+      <w:r>
+        <w:t xml:space="preserve">[Massey University].</w:t>
+      </w:r>
+      <w:r>
+        <w:t xml:space="preserve"> </w:t>
+      </w:r>
+      <w:hyperlink r:id="rId69">
+        <w:r>
+          <w:rPr>
+            <w:rStyle w:val="Hyperlink"/>
+          </w:rPr>
+          <w:t xml:space="preserve">http://hdl.handle.net/10179/1168</w:t>
+        </w:r>
+      </w:hyperlink>
+    </w:p>
+    <w:bookmarkEnd w:id="70"/>
+    <w:bookmarkStart w:id="72" w:name="ref-Carthey2014"/>
+    <w:p>
+      <w:pPr>
+        <w:pStyle w:val="Bibliography"/>
+      </w:pPr>
+      <w:r>
+        <w:t xml:space="preserve">Carthey, A. J. R., &amp; Banks, P. B. (2014). Naïveté in novel ecological interactions: Lessons from theory and experimental evidence.</w:t>
+      </w:r>
+      <w:r>
+        <w:t xml:space="preserve"> </w:t>
+      </w:r>
+      <w:r>
+        <w:rPr>
+          <w:i/>
+          <w:iCs/>
+        </w:rPr>
+        <w:t xml:space="preserve">Biological Reviews</w:t>
+      </w:r>
+      <w:r>
+        <w:t xml:space="preserve">,</w:t>
+      </w:r>
+      <w:r>
+        <w:t xml:space="preserve"> </w:t>
+      </w:r>
+      <w:r>
+        <w:rPr>
+          <w:i/>
+          <w:iCs/>
+        </w:rPr>
+        <w:t xml:space="preserve">89</w:t>
+      </w:r>
+      <w:r>
+        <w:t xml:space="preserve">(4), 932–949.</w:t>
+      </w:r>
+      <w:r>
+        <w:t xml:space="preserve"> </w:t>
+      </w:r>
+      <w:hyperlink r:id="rId71">
+        <w:r>
+          <w:rPr>
+            <w:rStyle w:val="Hyperlink"/>
+          </w:rPr>
+          <w:t xml:space="preserve">https://doi.org/10.1111/brv.12087</w:t>
+        </w:r>
+      </w:hyperlink>
+    </w:p>
+    <w:bookmarkEnd w:id="72"/>
+    <w:bookmarkStart w:id="73" w:name="ref-Collier1997"/>
+    <w:p>
+      <w:pPr>
+        <w:pStyle w:val="Bibliography"/>
+      </w:pPr>
+      <w:r>
+        <w:t xml:space="preserve">Collier, K. J., Parkyn, S. M., &amp; Rabeni, C. F. (1997). Koura: A keystone species.</w:t>
+      </w:r>
+      <w:r>
+        <w:t xml:space="preserve"> </w:t>
+      </w:r>
+      <w:r>
+        <w:rPr>
+          <w:i/>
+          <w:iCs/>
+        </w:rPr>
+        <w:t xml:space="preserve">Water and Atmosphere</w:t>
+      </w:r>
+      <w:r>
+        <w:t xml:space="preserve">,</w:t>
+      </w:r>
+      <w:r>
+        <w:t xml:space="preserve"> </w:t>
+      </w:r>
+      <w:r>
+        <w:rPr>
+          <w:i/>
+          <w:iCs/>
+        </w:rPr>
+        <w:t xml:space="preserve">5</w:t>
+      </w:r>
+      <w:r>
+        <w:t xml:space="preserve">(1), 18–20.</w:t>
+      </w:r>
+    </w:p>
+    <w:bookmarkEnd w:id="73"/>
+    <w:bookmarkStart w:id="75" w:name="ref-Dawkins1979"/>
+    <w:p>
+      <w:pPr>
+        <w:pStyle w:val="Bibliography"/>
+      </w:pPr>
+      <w:r>
+        <w:t xml:space="preserve">Dawkins, R., &amp; Krebs, J. R. (1979). Arms races between and within species.</w:t>
+      </w:r>
+      <w:r>
+        <w:t xml:space="preserve"> </w:t>
+      </w:r>
+      <w:r>
+        <w:rPr>
+          <w:i/>
+          <w:iCs/>
+        </w:rPr>
+        <w:t xml:space="preserve">Proceedings of the Royal Society of London. B. Biological Sciences</w:t>
+      </w:r>
+      <w:r>
+        <w:t xml:space="preserve">,</w:t>
+      </w:r>
+      <w:r>
+        <w:t xml:space="preserve"> </w:t>
+      </w:r>
+      <w:r>
+        <w:rPr>
+          <w:i/>
+          <w:iCs/>
+        </w:rPr>
+        <w:t xml:space="preserve">205</w:t>
+      </w:r>
+      <w:r>
+        <w:t xml:space="preserve">(1161), 489–511.</w:t>
+      </w:r>
+      <w:r>
+        <w:t xml:space="preserve"> </w:t>
+      </w:r>
+      <w:hyperlink r:id="rId74">
+        <w:r>
+          <w:rPr>
+            <w:rStyle w:val="Hyperlink"/>
+          </w:rPr>
+          <w:t xml:space="preserve">https://doi.org/10.1098/rspb.1979.0081</w:t>
+        </w:r>
+      </w:hyperlink>
+    </w:p>
+    <w:bookmarkEnd w:id="75"/>
+    <w:bookmarkStart w:id="77" w:name="ref-Dedual2019"/>
+    <w:p>
+      <w:pPr>
+        <w:pStyle w:val="Bibliography"/>
+      </w:pPr>
+      <w:r>
+        <w:t xml:space="preserve">Dedual, M. (2019).</w:t>
+      </w:r>
+      <w:r>
+        <w:t xml:space="preserve"> </w:t>
+      </w:r>
+      <w:r>
+        <w:rPr>
+          <w:i/>
+          <w:iCs/>
+        </w:rPr>
+        <w:t xml:space="preserve">Summary of the impacts and control methods of brown bullhead catfish (ameiurus nebulosus lesueur 1815) in new zealand and overseas</w:t>
+      </w:r>
+      <w:r>
+        <w:t xml:space="preserve">. Bay of Plenty Regional Council.</w:t>
+      </w:r>
+      <w:r>
+        <w:t xml:space="preserve"> </w:t>
+      </w:r>
+      <w:hyperlink r:id="rId76">
+        <w:r>
+          <w:rPr>
+            <w:rStyle w:val="Hyperlink"/>
+          </w:rPr>
+          <w:t xml:space="preserve">https://atlas.boprc.govt.nz/api/v1/edms/document/A3591759/content</w:t>
+        </w:r>
+      </w:hyperlink>
+    </w:p>
+    <w:bookmarkEnd w:id="77"/>
+    <w:bookmarkStart w:id="78" w:name="ref-Devcich1979"/>
+    <w:p>
+      <w:pPr>
+        <w:pStyle w:val="Bibliography"/>
+      </w:pPr>
+      <w:r>
+        <w:t xml:space="preserve">Devcich, A. A. (1979).</w:t>
+      </w:r>
+      <w:r>
+        <w:t xml:space="preserve"> </w:t>
+      </w:r>
+      <w:r>
+        <w:rPr>
+          <w:i/>
+          <w:iCs/>
+        </w:rPr>
+        <w:t xml:space="preserve">An ecological study of paranephrops planifrons white (decapoda: Parastacidae) in lake rotoiti, north island</w:t>
+      </w:r>
+      <w:r>
+        <w:t xml:space="preserve"> </w:t>
+      </w:r>
+      <w:r>
+        <w:t xml:space="preserve">[PhD thesis]. University of Waikato.</w:t>
+      </w:r>
+    </w:p>
+    <w:bookmarkEnd w:id="78"/>
+    <w:bookmarkStart w:id="80" w:name="ref-Doherty2016"/>
+    <w:p>
+      <w:pPr>
+        <w:pStyle w:val="Bibliography"/>
+      </w:pPr>
+      <w:r>
+        <w:t xml:space="preserve">Doherty, T. S., Glen, A. S., Nimmo, D. G., Ritchie, E. G., &amp; Dickman, C. R. (2016). Invasive predators and global biodiversity loss.</w:t>
+      </w:r>
+      <w:r>
+        <w:t xml:space="preserve"> </w:t>
+      </w:r>
+      <w:r>
+        <w:rPr>
+          <w:i/>
+          <w:iCs/>
+        </w:rPr>
+        <w:t xml:space="preserve">Proceedings of the National Academy of Sciences</w:t>
+      </w:r>
+      <w:r>
+        <w:t xml:space="preserve">,</w:t>
+      </w:r>
+      <w:r>
+        <w:t xml:space="preserve"> </w:t>
+      </w:r>
+      <w:r>
+        <w:rPr>
+          <w:i/>
+          <w:iCs/>
+        </w:rPr>
+        <w:t xml:space="preserve">113</w:t>
+      </w:r>
+      <w:r>
+        <w:t xml:space="preserve">(40), 11261–11265.</w:t>
+      </w:r>
+      <w:r>
+        <w:t xml:space="preserve"> </w:t>
+      </w:r>
+      <w:hyperlink r:id="rId79">
+        <w:r>
+          <w:rPr>
+            <w:rStyle w:val="Hyperlink"/>
+          </w:rPr>
+          <w:t xml:space="preserve">https://doi.org/10.1073/pnas.1602480113</w:t>
+        </w:r>
+      </w:hyperlink>
+    </w:p>
+    <w:bookmarkEnd w:id="80"/>
+    <w:bookmarkStart w:id="82" w:name="ref-Ehlman2019"/>
+    <w:p>
+      <w:pPr>
+        <w:pStyle w:val="Bibliography"/>
+      </w:pPr>
+      <w:r>
+        <w:t xml:space="preserve">Ehlman, S. M., Trimmer, P. C., &amp; Sih, A. (2019). Prey responses to exotic predators: Effects of old risks and new cues.</w:t>
+      </w:r>
+      <w:r>
+        <w:t xml:space="preserve"> </w:t>
+      </w:r>
+      <w:r>
+        <w:rPr>
+          <w:i/>
+          <w:iCs/>
+        </w:rPr>
+        <w:t xml:space="preserve">The American Naturalist</w:t>
+      </w:r>
+      <w:r>
+        <w:t xml:space="preserve">,</w:t>
+      </w:r>
+      <w:r>
+        <w:t xml:space="preserve"> </w:t>
+      </w:r>
+      <w:r>
+        <w:rPr>
+          <w:i/>
+          <w:iCs/>
+        </w:rPr>
+        <w:t xml:space="preserve">193</w:t>
+      </w:r>
+      <w:r>
+        <w:t xml:space="preserve">(4), 575–587.</w:t>
+      </w:r>
+      <w:r>
+        <w:t xml:space="preserve"> </w:t>
+      </w:r>
+      <w:hyperlink r:id="rId81">
+        <w:r>
+          <w:rPr>
+            <w:rStyle w:val="Hyperlink"/>
+          </w:rPr>
+          <w:t xml:space="preserve">https://doi.org/10.1086/702252</w:t>
+        </w:r>
+      </w:hyperlink>
+    </w:p>
+    <w:bookmarkEnd w:id="82"/>
+    <w:bookmarkStart w:id="84" w:name="ref-Figler2005"/>
+    <w:p>
+      <w:pPr>
+        <w:pStyle w:val="Bibliography"/>
+      </w:pPr>
+      <w:r>
+        <w:t xml:space="preserve">Figler, M. H., Blank, G. S., &amp; Peeke, H. V. S. (2005). Shelter competition between resident male red swamp crayfish procambarus clarkii (girard) and conspecific intruders varying by sex and reproductive status.</w:t>
+      </w:r>
+      <w:r>
+        <w:t xml:space="preserve"> </w:t>
+      </w:r>
+      <w:r>
+        <w:rPr>
+          <w:i/>
+          <w:iCs/>
+        </w:rPr>
+        <w:t xml:space="preserve">Marine and Freshwater Behaviour and Physiology</w:t>
+      </w:r>
+      <w:r>
+        <w:t xml:space="preserve">,</w:t>
+      </w:r>
+      <w:r>
+        <w:t xml:space="preserve"> </w:t>
+      </w:r>
+      <w:r>
+        <w:rPr>
+          <w:i/>
+          <w:iCs/>
+        </w:rPr>
+        <w:t xml:space="preserve">38</w:t>
+      </w:r>
+      <w:r>
+        <w:t xml:space="preserve">(4), 237–248.</w:t>
+      </w:r>
+      <w:r>
+        <w:t xml:space="preserve"> </w:t>
+      </w:r>
+      <w:hyperlink r:id="rId83">
+        <w:r>
+          <w:rPr>
+            <w:rStyle w:val="Hyperlink"/>
+          </w:rPr>
+          <w:t xml:space="preserve">https://doi.org/10.1080/10236240500376477</w:t>
+        </w:r>
+      </w:hyperlink>
+    </w:p>
+    <w:bookmarkEnd w:id="84"/>
+    <w:bookmarkStart w:id="85" w:name="ref-Fox2018"/>
+    <w:p>
+      <w:pPr>
+        <w:pStyle w:val="Bibliography"/>
+      </w:pPr>
+      <w:r>
+        <w:t xml:space="preserve">Fox, J., &amp; Weisberg, S. (2018).</w:t>
+      </w:r>
+      <w:r>
+        <w:t xml:space="preserve"> </w:t>
+      </w:r>
+      <w:r>
+        <w:rPr>
+          <w:i/>
+          <w:iCs/>
+        </w:rPr>
+        <w:t xml:space="preserve">An r companion to applied regression</w:t>
+      </w:r>
+      <w:r>
+        <w:t xml:space="preserve">. SAGE Publications.</w:t>
+      </w:r>
+    </w:p>
+    <w:bookmarkEnd w:id="85"/>
+    <w:bookmarkStart w:id="87" w:name="ref-Gamradt1996"/>
+    <w:p>
+      <w:pPr>
+        <w:pStyle w:val="Bibliography"/>
+      </w:pPr>
+      <w:r>
+        <w:t xml:space="preserve">Gamradt, S. C., &amp; Kats, L. B. (1996). Effect of introduced crayfish and mosquitofish on california newts.</w:t>
+      </w:r>
+      <w:r>
+        <w:t xml:space="preserve"> </w:t>
+      </w:r>
+      <w:r>
+        <w:rPr>
+          <w:i/>
+          <w:iCs/>
+        </w:rPr>
+        <w:t xml:space="preserve">Conservation Biology</w:t>
+      </w:r>
+      <w:r>
+        <w:t xml:space="preserve">,</w:t>
+      </w:r>
+      <w:r>
+        <w:t xml:space="preserve"> </w:t>
+      </w:r>
+      <w:r>
+        <w:rPr>
+          <w:i/>
+          <w:iCs/>
+        </w:rPr>
+        <w:t xml:space="preserve">10</w:t>
+      </w:r>
+      <w:r>
+        <w:t xml:space="preserve">(4), 1155–1162.</w:t>
+      </w:r>
+      <w:r>
+        <w:t xml:space="preserve"> </w:t>
+      </w:r>
+      <w:hyperlink r:id="rId86">
+        <w:r>
+          <w:rPr>
+            <w:rStyle w:val="Hyperlink"/>
+          </w:rPr>
+          <w:t xml:space="preserve">https://doi.org/10.1046/j.1523-1739.1996.10041155.x</w:t>
+        </w:r>
+      </w:hyperlink>
+    </w:p>
+    <w:bookmarkEnd w:id="87"/>
+    <w:bookmarkStart w:id="89" w:name="ref-Gherardi2011"/>
+    <w:p>
+      <w:pPr>
+        <w:pStyle w:val="Bibliography"/>
+      </w:pPr>
+      <w:r>
+        <w:t xml:space="preserve">Gherardi, F., Mavuti, K. M., Pacini, N., Tricarico, E., &amp; Harper, D. M. (2011). The smell of danger: Chemical recognition of fish predators by the invasive crayfish procambarus clarkii.</w:t>
+      </w:r>
+      <w:r>
+        <w:t xml:space="preserve"> </w:t>
+      </w:r>
+      <w:r>
+        <w:rPr>
+          <w:i/>
+          <w:iCs/>
+        </w:rPr>
+        <w:t xml:space="preserve">Freshwater Biology</w:t>
+      </w:r>
+      <w:r>
+        <w:t xml:space="preserve">,</w:t>
+      </w:r>
+      <w:r>
+        <w:t xml:space="preserve"> </w:t>
+      </w:r>
+      <w:r>
+        <w:rPr>
+          <w:i/>
+          <w:iCs/>
+        </w:rPr>
+        <w:t xml:space="preserve">56</w:t>
+      </w:r>
+      <w:r>
+        <w:t xml:space="preserve">(8), 1567–1578.</w:t>
+      </w:r>
+      <w:r>
+        <w:t xml:space="preserve"> </w:t>
+      </w:r>
+      <w:hyperlink r:id="rId88">
+        <w:r>
+          <w:rPr>
+            <w:rStyle w:val="Hyperlink"/>
+          </w:rPr>
+          <w:t xml:space="preserve">https://doi.org/10.1111/j.1365-2427.2011.02595.x</w:t>
+        </w:r>
+      </w:hyperlink>
+    </w:p>
+    <w:bookmarkEnd w:id="89"/>
+    <w:bookmarkStart w:id="91" w:name="ref-Hartig2024"/>
+    <w:p>
+      <w:pPr>
+        <w:pStyle w:val="Bibliography"/>
+      </w:pPr>
+      <w:r>
+        <w:t xml:space="preserve">Hartig, F., Lohse, L., &amp; leite, M. de S.</w:t>
+      </w:r>
+      <w:r>
+        <w:t xml:space="preserve"> (2024).</w:t>
+      </w:r>
+      <w:r>
+        <w:t xml:space="preserve"> </w:t>
+      </w:r>
+      <w:r>
+        <w:rPr>
+          <w:i/>
+          <w:iCs/>
+        </w:rPr>
+        <w:t xml:space="preserve">DHARMa: Residual diagnostics for hierarchical (multi-level / mixed) regression models</w:t>
+      </w:r>
+      <w:r>
+        <w:t xml:space="preserve"> </w:t>
+      </w:r>
+      <w:r>
+        <w:t xml:space="preserve">(Version 0.4.7) [Computer software].</w:t>
+      </w:r>
+      <w:r>
+        <w:t xml:space="preserve"> </w:t>
+      </w:r>
+      <w:hyperlink r:id="rId90">
+        <w:r>
+          <w:rPr>
+            <w:rStyle w:val="Hyperlink"/>
+          </w:rPr>
+          <w:t xml:space="preserve">https://cran.r-project.org/web/packages/DHARMa/index.html</w:t>
+        </w:r>
+      </w:hyperlink>
+    </w:p>
+    <w:bookmarkEnd w:id="91"/>
+    <w:bookmarkStart w:id="93" w:name="ref-Hazlett2003"/>
+    <w:p>
+      <w:pPr>
+        <w:pStyle w:val="Bibliography"/>
+      </w:pPr>
+      <w:r>
+        <w:t xml:space="preserve">Hazlett, B. A. (2003). The effects of starvation on crayfish responses to alarm odor.</w:t>
+      </w:r>
+      <w:r>
+        <w:t xml:space="preserve"> </w:t>
+      </w:r>
+      <w:r>
+        <w:rPr>
+          <w:i/>
+          <w:iCs/>
+        </w:rPr>
+        <w:t xml:space="preserve">Ethology</w:t>
+      </w:r>
+      <w:r>
+        <w:t xml:space="preserve">,</w:t>
+      </w:r>
+      <w:r>
+        <w:t xml:space="preserve"> </w:t>
+      </w:r>
+      <w:r>
+        <w:rPr>
+          <w:i/>
+          <w:iCs/>
+        </w:rPr>
+        <w:t xml:space="preserve">109</w:t>
+      </w:r>
+      <w:r>
+        <w:t xml:space="preserve">(7), 587–592.</w:t>
+      </w:r>
+      <w:r>
+        <w:t xml:space="preserve"> </w:t>
+      </w:r>
+      <w:hyperlink r:id="rId92">
+        <w:r>
+          <w:rPr>
+            <w:rStyle w:val="Hyperlink"/>
+          </w:rPr>
+          <w:t xml:space="preserve">https://doi.org/10.1046/j.1439-0310.2003.00902.x</w:t>
+        </w:r>
+      </w:hyperlink>
+    </w:p>
+    <w:bookmarkEnd w:id="93"/>
+    <w:bookmarkStart w:id="95" w:name="ref-Hicks1997"/>
+    <w:p>
+      <w:pPr>
+        <w:pStyle w:val="Bibliography"/>
+      </w:pPr>
+      <w:r>
+        <w:t xml:space="preserve">Hicks, B. J. (1997). Food webs in forest and pasture streams in the waikato region, new zealand: A study based on analyses of stable isotopes of carbon and nitrogen, and fish gut contents.</w:t>
+      </w:r>
+      <w:r>
+        <w:t xml:space="preserve"> </w:t>
+      </w:r>
+      <w:r>
+        <w:rPr>
+          <w:i/>
+          <w:iCs/>
+        </w:rPr>
+        <w:t xml:space="preserve">New Zealand Journal of Marine and Freshwater Research</w:t>
+      </w:r>
+      <w:r>
+        <w:t xml:space="preserve">,</w:t>
+      </w:r>
+      <w:r>
+        <w:t xml:space="preserve"> </w:t>
+      </w:r>
+      <w:r>
+        <w:rPr>
+          <w:i/>
+          <w:iCs/>
+        </w:rPr>
+        <w:t xml:space="preserve">31</w:t>
+      </w:r>
+      <w:r>
+        <w:t xml:space="preserve">(5), 651–664.</w:t>
+      </w:r>
+      <w:r>
+        <w:t xml:space="preserve"> </w:t>
+      </w:r>
+      <w:hyperlink r:id="rId94">
+        <w:r>
+          <w:rPr>
+            <w:rStyle w:val="Hyperlink"/>
+          </w:rPr>
+          <w:t xml:space="preserve">https://doi.org/10.1080/00288330.1997.9516796</w:t>
+        </w:r>
+      </w:hyperlink>
+    </w:p>
+    <w:bookmarkEnd w:id="95"/>
+    <w:bookmarkStart w:id="97" w:name="ref-Johnson2014"/>
+    <w:p>
+      <w:pPr>
+        <w:pStyle w:val="Bibliography"/>
+      </w:pPr>
+      <w:r>
+        <w:t xml:space="preserve">Johnson, M. F., Rice, S. P., &amp; Reid, I. (2014). The activity of signal crayfish (pacifastacus leniusculus) in relation to thermal and hydraulic dynamics of an alluvial stream, UK.</w:t>
+      </w:r>
+      <w:r>
+        <w:t xml:space="preserve"> </w:t>
+      </w:r>
+      <w:r>
+        <w:rPr>
+          <w:i/>
+          <w:iCs/>
+        </w:rPr>
+        <w:t xml:space="preserve">Hydrobiologia</w:t>
+      </w:r>
+      <w:r>
+        <w:t xml:space="preserve">,</w:t>
+      </w:r>
+      <w:r>
+        <w:t xml:space="preserve"> </w:t>
+      </w:r>
+      <w:r>
+        <w:rPr>
+          <w:i/>
+          <w:iCs/>
+        </w:rPr>
+        <w:t xml:space="preserve">724</w:t>
+      </w:r>
+      <w:r>
+        <w:t xml:space="preserve">(1), 41–54.</w:t>
+      </w:r>
+      <w:r>
+        <w:t xml:space="preserve"> </w:t>
+      </w:r>
+      <w:hyperlink r:id="rId96">
+        <w:r>
+          <w:rPr>
+            <w:rStyle w:val="Hyperlink"/>
+          </w:rPr>
+          <w:t xml:space="preserve">https://doi.org/10.1007/s10750-013-1708-1</w:t>
+        </w:r>
+      </w:hyperlink>
+    </w:p>
+    <w:bookmarkEnd w:id="97"/>
+    <w:bookmarkStart w:id="99" w:name="ref-Kindlinger2017"/>
+    <w:p>
+      <w:pPr>
+        <w:pStyle w:val="Bibliography"/>
+      </w:pPr>
+      <w:r>
+        <w:t xml:space="preserve">Kindinger, T. L., &amp; Albins, M. A. (2017). Consumptive and non-consumptive effects of an invasive marine predator on native coral-reef herbivores.</w:t>
+      </w:r>
+      <w:r>
+        <w:t xml:space="preserve"> </w:t>
+      </w:r>
+      <w:r>
+        <w:rPr>
+          <w:i/>
+          <w:iCs/>
+        </w:rPr>
+        <w:t xml:space="preserve">Biological Invasions</w:t>
+      </w:r>
+      <w:r>
+        <w:t xml:space="preserve">,</w:t>
+      </w:r>
+      <w:r>
+        <w:t xml:space="preserve"> </w:t>
+      </w:r>
+      <w:r>
+        <w:rPr>
+          <w:i/>
+          <w:iCs/>
+        </w:rPr>
+        <w:t xml:space="preserve">19</w:t>
+      </w:r>
+      <w:r>
+        <w:t xml:space="preserve">(1), 131–146.</w:t>
+      </w:r>
+      <w:r>
+        <w:t xml:space="preserve"> </w:t>
+      </w:r>
+      <w:hyperlink r:id="rId98">
+        <w:r>
+          <w:rPr>
+            <w:rStyle w:val="Hyperlink"/>
+          </w:rPr>
+          <w:t xml:space="preserve">https://doi.org/10.1007/s10530-016-1268-1</w:t>
+        </w:r>
+      </w:hyperlink>
+    </w:p>
+    <w:bookmarkEnd w:id="99"/>
+    <w:bookmarkStart w:id="100" w:name="ref-Kusabsinrevision"/>
+    <w:p>
+      <w:pPr>
+        <w:pStyle w:val="Bibliography"/>
+      </w:pPr>
+      <w:r>
+        <w:t xml:space="preserve">Kusabs, I. A., Duggan, I. C., Scholes, P., Bruere, A., Te Kurapa, T. W., Grant, T., &amp; Burdon, F. J. (n.d.). Invasive catfish linked to the decline of freshwater crayfish in two aotearoa new zealand lakes.</w:t>
+      </w:r>
+      <w:r>
+        <w:t xml:space="preserve"> </w:t>
+      </w:r>
+      <w:r>
+        <w:rPr>
+          <w:i/>
+          <w:iCs/>
+        </w:rPr>
+        <w:t xml:space="preserve">Manuscript Submitted for Publication</w:t>
+      </w:r>
+      <w:r>
+        <w:t xml:space="preserve">.</w:t>
+      </w:r>
+    </w:p>
+    <w:bookmarkEnd w:id="100"/>
+    <w:bookmarkStart w:id="102" w:name="ref-Kusabs2009"/>
+    <w:p>
+      <w:pPr>
+        <w:pStyle w:val="Bibliography"/>
+      </w:pPr>
+      <w:r>
+        <w:t xml:space="preserve">Kusabs, I. A., &amp; Quinn, J. M. (2009). Use of a traditional maori harvesting method, the tau kōura, for monitoring kōura (freshwater crayfish, paranephrops planifrons) in lake rotoiti, north island, new zealand.</w:t>
+      </w:r>
+      <w:r>
+        <w:t xml:space="preserve"> </w:t>
+      </w:r>
+      <w:r>
+        <w:rPr>
+          <w:i/>
+          <w:iCs/>
+        </w:rPr>
+        <w:t xml:space="preserve">New Zealand Journal of Marine and Freshwater Research</w:t>
+      </w:r>
+      <w:r>
+        <w:t xml:space="preserve">,</w:t>
+      </w:r>
+      <w:r>
+        <w:t xml:space="preserve"> </w:t>
+      </w:r>
+      <w:r>
+        <w:rPr>
+          <w:i/>
+          <w:iCs/>
+        </w:rPr>
+        <w:t xml:space="preserve">43</w:t>
+      </w:r>
+      <w:r>
+        <w:t xml:space="preserve">(3), 713–722.</w:t>
+      </w:r>
+      <w:r>
+        <w:t xml:space="preserve"> </w:t>
+      </w:r>
+      <w:hyperlink r:id="rId101">
+        <w:r>
+          <w:rPr>
+            <w:rStyle w:val="Hyperlink"/>
+          </w:rPr>
+          <w:t xml:space="preserve">https://doi.org/10.1080/00288330909510036</w:t>
+        </w:r>
+      </w:hyperlink>
+    </w:p>
+    <w:bookmarkEnd w:id="102"/>
+    <w:bookmarkStart w:id="104" w:name="ref-Lee2025"/>
+    <w:p>
+      <w:pPr>
+        <w:pStyle w:val="Bibliography"/>
+      </w:pPr>
+      <w:r>
+        <w:t xml:space="preserve">Lee, F., Kusabs, I. A. K., Perry, G. L. W., &amp; MacNeil, C. (2025). Identifying refugia from the synergistic threats of climate change and invasive species.</w:t>
+      </w:r>
+      <w:r>
+        <w:t xml:space="preserve"> </w:t>
+      </w:r>
+      <w:r>
+        <w:rPr>
+          <w:i/>
+          <w:iCs/>
+        </w:rPr>
+        <w:t xml:space="preserve">Web Ecology</w:t>
+      </w:r>
+      <w:r>
+        <w:t xml:space="preserve">,</w:t>
+      </w:r>
+      <w:r>
+        <w:t xml:space="preserve"> </w:t>
+      </w:r>
+      <w:r>
+        <w:rPr>
+          <w:i/>
+          <w:iCs/>
+        </w:rPr>
+        <w:t xml:space="preserve">25</w:t>
+      </w:r>
+      <w:r>
+        <w:t xml:space="preserve">(2), 221–239.</w:t>
+      </w:r>
+      <w:r>
+        <w:t xml:space="preserve"> </w:t>
+      </w:r>
+      <w:hyperlink r:id="rId103">
+        <w:r>
+          <w:rPr>
+            <w:rStyle w:val="Hyperlink"/>
+          </w:rPr>
+          <w:t xml:space="preserve">https://doi.org/10.5194/we-25-221-2025</w:t>
+        </w:r>
+      </w:hyperlink>
+    </w:p>
+    <w:bookmarkEnd w:id="104"/>
+    <w:bookmarkStart w:id="106" w:name="ref-Lenth2026"/>
+    <w:p>
+      <w:pPr>
+        <w:pStyle w:val="Bibliography"/>
+      </w:pPr>
+      <w:r>
+        <w:t xml:space="preserve">Lenth, R. V., Piaskowski, J., Banfai, B., Bolker, B., Buerkner, P., Giné-Vázquez, I., Hervé, M., Jung, M., Love, J., Miguez, F., Riebl, H., &amp; Singmann, H. (2026).</w:t>
+      </w:r>
+      <w:r>
+        <w:t xml:space="preserve"> </w:t>
+      </w:r>
+      <w:r>
+        <w:rPr>
+          <w:i/>
+          <w:iCs/>
+        </w:rPr>
+        <w:t xml:space="preserve">Emmeans: Estimated marginal means, aka least-squares means</w:t>
+      </w:r>
+      <w:r>
+        <w:t xml:space="preserve"> </w:t>
+      </w:r>
+      <w:r>
+        <w:t xml:space="preserve">(Version 2.0.2) [Computer software].</w:t>
+      </w:r>
+      <w:r>
+        <w:t xml:space="preserve"> </w:t>
+      </w:r>
+      <w:hyperlink r:id="rId105">
+        <w:r>
+          <w:rPr>
+            <w:rStyle w:val="Hyperlink"/>
+          </w:rPr>
+          <w:t xml:space="preserve">https://cran.r-project.org/web/packages/emmeans/index.html</w:t>
+        </w:r>
+      </w:hyperlink>
+    </w:p>
+    <w:bookmarkEnd w:id="106"/>
+    <w:bookmarkStart w:id="108" w:name="ref-Lima1990"/>
+    <w:p>
+      <w:pPr>
+        <w:pStyle w:val="Bibliography"/>
+      </w:pPr>
+      <w:r>
+        <w:t xml:space="preserve">Lima, S. L., &amp; Dill, L. M. (1990). Behavioral decisions made under the risk of predation: A review and prospectus.</w:t>
+      </w:r>
+      <w:r>
+        <w:t xml:space="preserve"> </w:t>
+      </w:r>
+      <w:r>
+        <w:rPr>
+          <w:i/>
+          <w:iCs/>
+        </w:rPr>
+        <w:t xml:space="preserve">Canadian Journal of Zoology</w:t>
+      </w:r>
+      <w:r>
+        <w:t xml:space="preserve">,</w:t>
+      </w:r>
+      <w:r>
+        <w:t xml:space="preserve"> </w:t>
+      </w:r>
+      <w:r>
+        <w:rPr>
+          <w:i/>
+          <w:iCs/>
+        </w:rPr>
+        <w:t xml:space="preserve">68</w:t>
+      </w:r>
+      <w:r>
+        <w:t xml:space="preserve">(4), 619–640.</w:t>
+      </w:r>
+      <w:r>
+        <w:t xml:space="preserve"> </w:t>
+      </w:r>
+      <w:hyperlink r:id="rId107">
+        <w:r>
+          <w:rPr>
+            <w:rStyle w:val="Hyperlink"/>
+          </w:rPr>
+          <w:t xml:space="preserve">https://doi.org/10.1139/z90-092</w:t>
+        </w:r>
+      </w:hyperlink>
+    </w:p>
+    <w:bookmarkEnd w:id="108"/>
+    <w:bookmarkStart w:id="110" w:name="ref-MacNeil2025"/>
+    <w:p>
+      <w:pPr>
+        <w:pStyle w:val="Bibliography"/>
+      </w:pPr>
+      <w:r>
+        <w:t xml:space="preserve">MacNeil, C., Lee, F., Kusabs, I., &amp; Holmes, R. (2025). The biter bit; scavenging behaviour of native freshwater crayfish on the carrion of native and introduced fish predators in aotearoa-new zealand.</w:t>
+      </w:r>
+      <w:r>
+        <w:t xml:space="preserve"> </w:t>
+      </w:r>
+      <w:r>
+        <w:rPr>
+          <w:i/>
+          <w:iCs/>
+        </w:rPr>
+        <w:t xml:space="preserve">Knowledge &amp; Management of Aquatic Ecosystems</w:t>
+      </w:r>
+      <w:r>
+        <w:t xml:space="preserve">, (426), 29.</w:t>
+      </w:r>
+      <w:r>
+        <w:t xml:space="preserve"> </w:t>
+      </w:r>
+      <w:hyperlink r:id="rId109">
+        <w:r>
+          <w:rPr>
+            <w:rStyle w:val="Hyperlink"/>
+          </w:rPr>
+          <w:t xml:space="preserve">https://doi.org/10.1051/kmae/2025022</w:t>
+        </w:r>
+      </w:hyperlink>
+    </w:p>
+    <w:bookmarkEnd w:id="110"/>
+    <w:bookmarkStart w:id="112" w:name="ref-Martin2014"/>
+    <w:p>
+      <w:pPr>
+        <w:pStyle w:val="Bibliography"/>
+      </w:pPr>
+      <w:r>
+        <w:t xml:space="preserve">Martin, C. W. (2014). Naïve prey exhibit reduced antipredator behavior and survivorship.</w:t>
+      </w:r>
+      <w:r>
+        <w:t xml:space="preserve"> </w:t>
+      </w:r>
+      <w:r>
+        <w:rPr>
+          <w:i/>
+          <w:iCs/>
+        </w:rPr>
+        <w:t xml:space="preserve">PeerJ</w:t>
+      </w:r>
+      <w:r>
+        <w:t xml:space="preserve">,</w:t>
+      </w:r>
+      <w:r>
+        <w:t xml:space="preserve"> </w:t>
+      </w:r>
+      <w:r>
+        <w:rPr>
+          <w:i/>
+          <w:iCs/>
+        </w:rPr>
+        <w:t xml:space="preserve">2</w:t>
+      </w:r>
+      <w:r>
+        <w:t xml:space="preserve">, e665.</w:t>
+      </w:r>
+      <w:r>
+        <w:t xml:space="preserve"> </w:t>
+      </w:r>
+      <w:hyperlink r:id="rId111">
+        <w:r>
+          <w:rPr>
+            <w:rStyle w:val="Hyperlink"/>
+          </w:rPr>
+          <w:t xml:space="preserve">https://doi.org/10.7717/peerj.665</w:t>
+        </w:r>
+      </w:hyperlink>
+    </w:p>
+    <w:bookmarkEnd w:id="112"/>
+    <w:bookmarkStart w:id="114" w:name="ref-McDowall1990"/>
+    <w:p>
+      <w:pPr>
+        <w:pStyle w:val="Bibliography"/>
+      </w:pPr>
+      <w:r>
+        <w:t xml:space="preserve">McDowall, R. M. (1990).</w:t>
+      </w:r>
+      <w:r>
+        <w:t xml:space="preserve"> </w:t>
+      </w:r>
+      <w:r>
+        <w:rPr>
+          <w:i/>
+          <w:iCs/>
+        </w:rPr>
+        <w:t xml:space="preserve">New zealand freshwater fishes: A natural history and guide</w:t>
+      </w:r>
+      <w:r>
+        <w:t xml:space="preserve">.</w:t>
+      </w:r>
+      <w:r>
+        <w:t xml:space="preserve"> </w:t>
+      </w:r>
+      <w:hyperlink r:id="rId113">
+        <w:r>
+          <w:rPr>
+            <w:rStyle w:val="Hyperlink"/>
+          </w:rPr>
+          <w:t xml:space="preserve">https://agris.fao.org/search/en/providers/122621/records/6473966cce9437aa76003d0e</w:t>
+        </w:r>
+      </w:hyperlink>
+    </w:p>
+    <w:bookmarkEnd w:id="114"/>
+    <w:bookmarkStart w:id="116" w:name="ref-Nystrom2005"/>
+    <w:p>
+      <w:pPr>
+        <w:pStyle w:val="Bibliography"/>
+      </w:pPr>
+      <w:r>
+        <w:t xml:space="preserve">Nyström, P. (2005). Non‐lethal predator effects on the performance of a native and an exotic crayfish species.</w:t>
+      </w:r>
+      <w:r>
+        <w:t xml:space="preserve"> </w:t>
+      </w:r>
+      <w:r>
+        <w:rPr>
+          <w:i/>
+          <w:iCs/>
+        </w:rPr>
+        <w:t xml:space="preserve">Freshwater Biology</w:t>
+      </w:r>
+      <w:r>
+        <w:t xml:space="preserve">,</w:t>
+      </w:r>
+      <w:r>
+        <w:t xml:space="preserve"> </w:t>
+      </w:r>
+      <w:r>
+        <w:rPr>
+          <w:i/>
+          <w:iCs/>
+        </w:rPr>
+        <w:t xml:space="preserve">50</w:t>
+      </w:r>
+      <w:r>
+        <w:t xml:space="preserve">(12), 1938–1949.</w:t>
+      </w:r>
+      <w:r>
+        <w:t xml:space="preserve"> </w:t>
+      </w:r>
+      <w:hyperlink r:id="rId115">
+        <w:r>
+          <w:rPr>
+            <w:rStyle w:val="Hyperlink"/>
+          </w:rPr>
+          <w:t xml:space="preserve">https://doi.org/10.1111/j.1365-2427.2005.01438.x</w:t>
+        </w:r>
+      </w:hyperlink>
+    </w:p>
+    <w:bookmarkEnd w:id="116"/>
+    <w:bookmarkStart w:id="118" w:name="ref-Parkyn2001"/>
+    <w:p>
+      <w:pPr>
+        <w:pStyle w:val="Bibliography"/>
+      </w:pPr>
+      <w:r>
+        <w:t xml:space="preserve">Parkyn, S. M., Collier, K. J., &amp; Hicks, B. J. (2001). New zealand stream crayfish: Functional omnivores but trophic predators?</w:t>
+      </w:r>
+      <w:r>
+        <w:t xml:space="preserve"> </w:t>
+      </w:r>
+      <w:r>
+        <w:rPr>
+          <w:i/>
+          <w:iCs/>
+        </w:rPr>
+        <w:t xml:space="preserve">Freshwater Biology</w:t>
+      </w:r>
+      <w:r>
+        <w:t xml:space="preserve">,</w:t>
+      </w:r>
+      <w:r>
+        <w:t xml:space="preserve"> </w:t>
+      </w:r>
+      <w:r>
+        <w:rPr>
+          <w:i/>
+          <w:iCs/>
+        </w:rPr>
+        <w:t xml:space="preserve">46</w:t>
+      </w:r>
+      <w:r>
+        <w:t xml:space="preserve">(5), 641–652.</w:t>
+      </w:r>
+      <w:r>
+        <w:t xml:space="preserve"> </w:t>
+      </w:r>
+      <w:hyperlink r:id="rId117">
+        <w:r>
+          <w:rPr>
+            <w:rStyle w:val="Hyperlink"/>
+          </w:rPr>
+          <w:t xml:space="preserve">https://doi.org/10.1046/j.1365-2427.2001.00702.x</w:t>
+        </w:r>
+      </w:hyperlink>
+    </w:p>
+    <w:bookmarkEnd w:id="118"/>
+    <w:bookmarkStart w:id="120" w:name="ref-Preisser2005"/>
+    <w:p>
+      <w:pPr>
+        <w:pStyle w:val="Bibliography"/>
+      </w:pPr>
+      <w:r>
+        <w:t xml:space="preserve">Preisser, E. L., Bolnick, D. I., &amp; Benard, M. F. (2005). Scared to death? The effects of intimidation and consumption in predator–prey interactions.</w:t>
+      </w:r>
+      <w:r>
+        <w:t xml:space="preserve"> </w:t>
+      </w:r>
+      <w:r>
+        <w:rPr>
+          <w:i/>
+          <w:iCs/>
+        </w:rPr>
+        <w:t xml:space="preserve">Ecology</w:t>
+      </w:r>
+      <w:r>
+        <w:t xml:space="preserve">,</w:t>
+      </w:r>
+      <w:r>
+        <w:t xml:space="preserve"> </w:t>
+      </w:r>
+      <w:r>
+        <w:rPr>
+          <w:i/>
+          <w:iCs/>
+        </w:rPr>
+        <w:t xml:space="preserve">86</w:t>
+      </w:r>
+      <w:r>
+        <w:t xml:space="preserve">(2), 501–509.</w:t>
+      </w:r>
+      <w:r>
+        <w:t xml:space="preserve"> </w:t>
+      </w:r>
+      <w:hyperlink r:id="rId119">
+        <w:r>
+          <w:rPr>
+            <w:rStyle w:val="Hyperlink"/>
+          </w:rPr>
+          <w:t xml:space="preserve">https://doi.org/10.1890/04-0719</w:t>
+        </w:r>
+      </w:hyperlink>
+    </w:p>
+    <w:bookmarkEnd w:id="120"/>
+    <w:bookmarkStart w:id="122" w:name="ref-RCoreTeam2025"/>
+    <w:p>
+      <w:pPr>
+        <w:pStyle w:val="Bibliography"/>
+      </w:pPr>
+      <w:r>
+        <w:t xml:space="preserve">R Core Team. (2025).</w:t>
+      </w:r>
+      <w:r>
+        <w:t xml:space="preserve"> </w:t>
+      </w:r>
+      <w:r>
+        <w:rPr>
+          <w:i/>
+          <w:iCs/>
+        </w:rPr>
+        <w:t xml:space="preserve">R: A language and environment for statistical computing</w:t>
+      </w:r>
+      <w:r>
+        <w:t xml:space="preserve"> </w:t>
+      </w:r>
+      <w:r>
+        <w:t xml:space="preserve">[Computer software]. R Foundation for Statistical Computing.</w:t>
+      </w:r>
+      <w:r>
+        <w:t xml:space="preserve"> </w:t>
+      </w:r>
+      <w:hyperlink r:id="rId121">
+        <w:r>
+          <w:rPr>
+            <w:rStyle w:val="Hyperlink"/>
+          </w:rPr>
+          <w:t xml:space="preserve">https://www.R-project.org/</w:t>
+        </w:r>
+      </w:hyperlink>
+    </w:p>
+    <w:bookmarkEnd w:id="122"/>
+    <w:bookmarkStart w:id="124" w:name="ref-RambergPihl2020"/>
+    <w:p>
+      <w:pPr>
+        <w:pStyle w:val="Bibliography"/>
+      </w:pPr>
+      <w:r>
+        <w:t xml:space="preserve">Ramberg-Pihl, N. C., &amp; Yurewicz, K. L. (2020). Behavioral responses of northern crayfish (faxonius virilis) to conspecific alarm cues and predator cues from smallmouth bass (micropterus dolomieu).</w:t>
+      </w:r>
+      <w:r>
+        <w:t xml:space="preserve"> </w:t>
+      </w:r>
+      <w:r>
+        <w:rPr>
+          <w:i/>
+          <w:iCs/>
+        </w:rPr>
+        <w:t xml:space="preserve">Marine and Freshwater Behaviour and Physiology</w:t>
+      </w:r>
+      <w:r>
+        <w:t xml:space="preserve">,</w:t>
+      </w:r>
+      <w:r>
+        <w:t xml:space="preserve"> </w:t>
+      </w:r>
+      <w:r>
+        <w:rPr>
+          <w:i/>
+          <w:iCs/>
+        </w:rPr>
+        <w:t xml:space="preserve">53</w:t>
+      </w:r>
+      <w:r>
+        <w:t xml:space="preserve">(1), 1–16.</w:t>
+      </w:r>
+      <w:r>
+        <w:t xml:space="preserve"> </w:t>
+      </w:r>
+      <w:hyperlink r:id="rId123">
+        <w:r>
+          <w:rPr>
+            <w:rStyle w:val="Hyperlink"/>
+          </w:rPr>
+          <w:t xml:space="preserve">https://doi.org/10.1080/10236244.2020.1717338</w:t>
+        </w:r>
+      </w:hyperlink>
+    </w:p>
+    <w:bookmarkEnd w:id="124"/>
+    <w:bookmarkStart w:id="126" w:name="ref-Ryan2009"/>
+    <w:p>
+      <w:pPr>
+        <w:pStyle w:val="Bibliography"/>
+      </w:pPr>
+      <w:r>
+        <w:t xml:space="preserve">Ryan, P. (2009).</w:t>
+      </w:r>
+      <w:r>
+        <w:t xml:space="preserve"> </w:t>
+      </w:r>
+      <w:r>
+        <w:rPr>
+          <w:i/>
+          <w:iCs/>
+        </w:rPr>
+        <w:t xml:space="preserve">Eels | te ara encyclopedia of new zealand</w:t>
+      </w:r>
+      <w:r>
+        <w:t xml:space="preserve">.</w:t>
+      </w:r>
+      <w:r>
+        <w:t xml:space="preserve"> </w:t>
+      </w:r>
+      <w:hyperlink r:id="rId125">
+        <w:r>
+          <w:rPr>
+            <w:rStyle w:val="Hyperlink"/>
+          </w:rPr>
+          <w:t xml:space="preserve">https://teara.govt.nz/en/eels</w:t>
+        </w:r>
+      </w:hyperlink>
+    </w:p>
+    <w:bookmarkEnd w:id="126"/>
+    <w:bookmarkStart w:id="127" w:name="ref-Scott1973"/>
+    <w:p>
+      <w:pPr>
+        <w:pStyle w:val="Bibliography"/>
+      </w:pPr>
+      <w:r>
+        <w:t xml:space="preserve">Scott, W. B., &amp; Crossman, E. J. (1973).</w:t>
+      </w:r>
+      <w:r>
+        <w:t xml:space="preserve"> </w:t>
+      </w:r>
+      <w:r>
+        <w:rPr>
+          <w:i/>
+          <w:iCs/>
+        </w:rPr>
+        <w:t xml:space="preserve">Freshwater fishes of canada</w:t>
+      </w:r>
+      <w:r>
+        <w:t xml:space="preserve">. Fisheries Research Board of Canada.</w:t>
+      </w:r>
+    </w:p>
+    <w:bookmarkEnd w:id="127"/>
+    <w:bookmarkStart w:id="128" w:name="ref-Shave1994"/>
+    <w:p>
+      <w:pPr>
+        <w:pStyle w:val="Bibliography"/>
+      </w:pPr>
+      <w:r>
+        <w:t xml:space="preserve">Shave, Cathy. R., Townsend, C. R., &amp; Crowl, T. A. (1994). Anti-predator behaviours of a freshwater crayfish (paranephrops zealandicus) to a native and an introduced predator.</w:t>
+      </w:r>
+      <w:r>
+        <w:t xml:space="preserve"> </w:t>
+      </w:r>
+      <w:r>
+        <w:rPr>
+          <w:i/>
+          <w:iCs/>
+        </w:rPr>
+        <w:t xml:space="preserve">New Zealand Journal of Ecology</w:t>
+      </w:r>
+      <w:r>
+        <w:t xml:space="preserve">,</w:t>
+      </w:r>
+      <w:r>
+        <w:t xml:space="preserve"> </w:t>
+      </w:r>
+      <w:r>
+        <w:rPr>
+          <w:i/>
+          <w:iCs/>
+        </w:rPr>
+        <w:t xml:space="preserve">18</w:t>
+      </w:r>
+      <w:r>
+        <w:t xml:space="preserve">(1), 1–10.</w:t>
+      </w:r>
+    </w:p>
+    <w:bookmarkEnd w:id="128"/>
+    <w:bookmarkStart w:id="130" w:name="ref-Sheriff2020"/>
+    <w:p>
+      <w:pPr>
+        <w:pStyle w:val="Bibliography"/>
+      </w:pPr>
+      <w:r>
+        <w:t xml:space="preserve">Sheriff, M. J., Peacor, S. D., Hawlena, D., &amp; Thaker, M. (2020). Non-consumptive predator effects on prey population size: A dearth of evidence.</w:t>
+      </w:r>
+      <w:r>
+        <w:t xml:space="preserve"> </w:t>
+      </w:r>
+      <w:r>
+        <w:rPr>
+          <w:i/>
+          <w:iCs/>
+        </w:rPr>
+        <w:t xml:space="preserve">Journal of Animal Ecology</w:t>
+      </w:r>
+      <w:r>
+        <w:t xml:space="preserve">,</w:t>
+      </w:r>
+      <w:r>
+        <w:t xml:space="preserve"> </w:t>
+      </w:r>
+      <w:r>
+        <w:rPr>
+          <w:i/>
+          <w:iCs/>
+        </w:rPr>
+        <w:t xml:space="preserve">89</w:t>
+      </w:r>
+      <w:r>
+        <w:t xml:space="preserve">(6), 1302–1316.</w:t>
+      </w:r>
+      <w:r>
+        <w:t xml:space="preserve"> </w:t>
+      </w:r>
+      <w:hyperlink r:id="rId129">
+        <w:r>
+          <w:rPr>
+            <w:rStyle w:val="Hyperlink"/>
+          </w:rPr>
+          <w:t xml:space="preserve">https://doi.org/10.1111/1365-2656.13213</w:t>
+        </w:r>
+      </w:hyperlink>
+    </w:p>
+    <w:bookmarkEnd w:id="130"/>
+    <w:bookmarkStart w:id="132" w:name="ref-Sih2010"/>
+    <w:p>
+      <w:pPr>
+        <w:pStyle w:val="Bibliography"/>
+      </w:pPr>
+      <w:r>
+        <w:t xml:space="preserve">Sih, A., Bolnick, D. I., Luttbeg, B., Orrock, J. L., Peacor, S. D., Pintor, L. M., Preisser, E., Rehage, J. S., &amp; Vonesh, J. R. (2010). Predator–prey naïveté, antipredator behavior, and the ecology of predator invasions.</w:t>
+      </w:r>
+      <w:r>
+        <w:t xml:space="preserve"> </w:t>
+      </w:r>
+      <w:r>
+        <w:rPr>
+          <w:i/>
+          <w:iCs/>
+        </w:rPr>
+        <w:t xml:space="preserve">Oikos</w:t>
+      </w:r>
+      <w:r>
+        <w:t xml:space="preserve">,</w:t>
+      </w:r>
+      <w:r>
+        <w:t xml:space="preserve"> </w:t>
+      </w:r>
+      <w:r>
+        <w:rPr>
+          <w:i/>
+          <w:iCs/>
+        </w:rPr>
+        <w:t xml:space="preserve">119</w:t>
+      </w:r>
+      <w:r>
+        <w:t xml:space="preserve">(4), 610–621.</w:t>
+      </w:r>
+      <w:r>
+        <w:t xml:space="preserve"> </w:t>
+      </w:r>
+      <w:hyperlink r:id="rId131">
+        <w:r>
+          <w:rPr>
+            <w:rStyle w:val="Hyperlink"/>
+          </w:rPr>
+          <w:t xml:space="preserve">https://doi.org/10.1111/j.1600-0706.2009.18039.x</w:t>
+        </w:r>
+      </w:hyperlink>
+    </w:p>
+    <w:bookmarkEnd w:id="132"/>
+    <w:bookmarkStart w:id="134" w:name="ref-Sih2023"/>
+    <w:p>
+      <w:pPr>
+        <w:pStyle w:val="Bibliography"/>
+      </w:pPr>
+      <w:r>
+        <w:t xml:space="preserve">Sih, A., Chung, H. J., Neylan, I., Ortiz-Jimenez, C., Sakai, O., &amp; Szeligowski, R. (2023). Fear generalization and behavioral responses to multiple dangers.</w:t>
+      </w:r>
+      <w:r>
+        <w:t xml:space="preserve"> </w:t>
+      </w:r>
+      <w:r>
+        <w:rPr>
+          <w:i/>
+          <w:iCs/>
+        </w:rPr>
+        <w:t xml:space="preserve">Trends in Ecology &amp; Evolution</w:t>
+      </w:r>
+      <w:r>
+        <w:t xml:space="preserve">,</w:t>
+      </w:r>
+      <w:r>
+        <w:t xml:space="preserve"> </w:t>
+      </w:r>
+      <w:r>
+        <w:rPr>
+          <w:i/>
+          <w:iCs/>
+        </w:rPr>
+        <w:t xml:space="preserve">38</w:t>
+      </w:r>
+      <w:r>
+        <w:t xml:space="preserve">(4), 369–380.</w:t>
+      </w:r>
+      <w:r>
+        <w:t xml:space="preserve"> </w:t>
+      </w:r>
+      <w:hyperlink r:id="rId133">
+        <w:r>
+          <w:rPr>
+            <w:rStyle w:val="Hyperlink"/>
+          </w:rPr>
+          <w:t xml:space="preserve">https://doi.org/10.1016/j.tree.2022.11.001</w:t>
+        </w:r>
+      </w:hyperlink>
+    </w:p>
+    <w:bookmarkEnd w:id="134"/>
+    <w:bookmarkStart w:id="136" w:name="ref-Smith2008"/>
+    <w:p>
+      <w:pPr>
+        <w:pStyle w:val="Bibliography"/>
+      </w:pPr>
+      <w:r>
+        <w:t xml:space="preserve">Smith, G. R., Boyd, A., Dayer, C. B., &amp; Winter, K. E. (2008). Behavioral responses of american toad and bullfrog tadpoles to the presence of cues from the invasive fish, gambusia affinis.</w:t>
+      </w:r>
+      <w:r>
+        <w:t xml:space="preserve"> </w:t>
+      </w:r>
+      <w:r>
+        <w:rPr>
+          <w:i/>
+          <w:iCs/>
+        </w:rPr>
+        <w:t xml:space="preserve">Biological Invasions</w:t>
+      </w:r>
+      <w:r>
+        <w:t xml:space="preserve">,</w:t>
+      </w:r>
+      <w:r>
+        <w:t xml:space="preserve"> </w:t>
+      </w:r>
+      <w:r>
+        <w:rPr>
+          <w:i/>
+          <w:iCs/>
+        </w:rPr>
+        <w:t xml:space="preserve">10</w:t>
+      </w:r>
+      <w:r>
+        <w:t xml:space="preserve">(5), 743–748.</w:t>
+      </w:r>
+      <w:r>
+        <w:t xml:space="preserve"> </w:t>
+      </w:r>
+      <w:hyperlink r:id="rId135">
+        <w:r>
+          <w:rPr>
+            <w:rStyle w:val="Hyperlink"/>
+          </w:rPr>
+          <w:t xml:space="preserve">https://doi.org/10.1007/s10530-007-9166-1</w:t>
+        </w:r>
+      </w:hyperlink>
+    </w:p>
+    <w:bookmarkEnd w:id="136"/>
+    <w:bookmarkStart w:id="138" w:name="ref-Stebbing2010"/>
+    <w:p>
+      <w:pPr>
+        <w:pStyle w:val="Bibliography"/>
+      </w:pPr>
+      <w:r>
+        <w:t xml:space="preserve">Stebbing, P. D., Watson, G. J., &amp; Bentley, M. G. (2010). The response to disturbance chemicals and predator odours of juvenile and adult signal crayfish pacifastacus leniusculus (dana).</w:t>
+      </w:r>
+      <w:r>
+        <w:t xml:space="preserve"> </w:t>
+      </w:r>
+      <w:r>
+        <w:rPr>
+          <w:i/>
+          <w:iCs/>
+        </w:rPr>
+        <w:t xml:space="preserve">Marine and Freshwater Behaviour and Physiology</w:t>
+      </w:r>
+      <w:r>
+        <w:t xml:space="preserve">,</w:t>
+      </w:r>
+      <w:r>
+        <w:t xml:space="preserve"> </w:t>
+      </w:r>
+      <w:r>
+        <w:rPr>
+          <w:i/>
+          <w:iCs/>
+        </w:rPr>
+        <w:t xml:space="preserve">43</w:t>
+      </w:r>
+      <w:r>
+        <w:t xml:space="preserve">(3), 183–195.</w:t>
+      </w:r>
+      <w:r>
+        <w:t xml:space="preserve"> </w:t>
+      </w:r>
+      <w:hyperlink r:id="rId137">
+        <w:r>
+          <w:rPr>
+            <w:rStyle w:val="Hyperlink"/>
+          </w:rPr>
+          <w:t xml:space="preserve">https://doi.org/10.1080/10236244.2010.487301</w:t>
+        </w:r>
+      </w:hyperlink>
+    </w:p>
+    <w:bookmarkEnd w:id="138"/>
+    <w:bookmarkStart w:id="140" w:name="ref-Stein1976"/>
+    <w:p>
+      <w:pPr>
+        <w:pStyle w:val="Bibliography"/>
+      </w:pPr>
+      <w:r>
+        <w:t xml:space="preserve">Stein, R. A., &amp; Magnuson, J. J. (1976). Behavioral response of crayfish to a fish predator.</w:t>
+      </w:r>
+      <w:r>
+        <w:t xml:space="preserve"> </w:t>
+      </w:r>
+      <w:r>
+        <w:rPr>
+          <w:i/>
+          <w:iCs/>
+        </w:rPr>
+        <w:t xml:space="preserve">Ecology</w:t>
+      </w:r>
+      <w:r>
+        <w:t xml:space="preserve">,</w:t>
+      </w:r>
+      <w:r>
+        <w:t xml:space="preserve"> </w:t>
+      </w:r>
+      <w:r>
+        <w:rPr>
+          <w:i/>
+          <w:iCs/>
+        </w:rPr>
+        <w:t xml:space="preserve">57</w:t>
+      </w:r>
+      <w:r>
+        <w:t xml:space="preserve">(4), 751–761.</w:t>
+      </w:r>
+      <w:r>
+        <w:t xml:space="preserve"> </w:t>
+      </w:r>
+      <w:hyperlink r:id="rId139">
+        <w:r>
+          <w:rPr>
+            <w:rStyle w:val="Hyperlink"/>
+          </w:rPr>
+          <w:t xml:space="preserve">https://doi.org/10.2307/1936188</w:t>
+        </w:r>
+      </w:hyperlink>
+    </w:p>
+    <w:bookmarkEnd w:id="140"/>
+    <w:bookmarkStart w:id="142" w:name="ref-Usio2004"/>
+    <w:p>
+      <w:pPr>
+        <w:pStyle w:val="Bibliography"/>
+      </w:pPr>
+      <w:r>
+        <w:t xml:space="preserve">Usio, N., &amp; Townsend, C. R. (2004). Roles of crayfish: Consequences of predation and bioturbation for stream invertebrates.</w:t>
+      </w:r>
+      <w:r>
+        <w:t xml:space="preserve"> </w:t>
+      </w:r>
+      <w:r>
+        <w:rPr>
+          <w:i/>
+          <w:iCs/>
+        </w:rPr>
+        <w:t xml:space="preserve">Ecology</w:t>
+      </w:r>
+      <w:r>
+        <w:t xml:space="preserve">,</w:t>
+      </w:r>
+      <w:r>
+        <w:t xml:space="preserve"> </w:t>
+      </w:r>
+      <w:r>
+        <w:rPr>
+          <w:i/>
+          <w:iCs/>
+        </w:rPr>
+        <w:t xml:space="preserve">85</w:t>
+      </w:r>
+      <w:r>
+        <w:t xml:space="preserve">(3), 807–822.</w:t>
+      </w:r>
+      <w:r>
+        <w:t xml:space="preserve"> </w:t>
+      </w:r>
+      <w:hyperlink r:id="rId141">
+        <w:r>
+          <w:rPr>
+            <w:rStyle w:val="Hyperlink"/>
+          </w:rPr>
+          <w:t xml:space="preserve">https://doi.org/10.1890/02-0618</w:t>
+        </w:r>
+      </w:hyperlink>
+    </w:p>
+    <w:bookmarkEnd w:id="142"/>
+    <w:bookmarkStart w:id="144" w:name="ref-Wood2020a"/>
+    <w:p>
+      <w:pPr>
+        <w:pStyle w:val="Bibliography"/>
+      </w:pPr>
+      <w:r>
+        <w:t xml:space="preserve">Wood, T. C., &amp; Moore, P. A. (2020a). Big and bad: How relative predator size and dietary information influence rusty crayfish (faxonius rusticus) behavior and resource-use decisions.</w:t>
+      </w:r>
+      <w:r>
+        <w:t xml:space="preserve"> </w:t>
+      </w:r>
+      <w:r>
+        <w:rPr>
+          <w:i/>
+          <w:iCs/>
+        </w:rPr>
+        <w:t xml:space="preserve">Canadian Journal of Zoology</w:t>
+      </w:r>
+      <w:r>
+        <w:t xml:space="preserve">,</w:t>
+      </w:r>
+      <w:r>
+        <w:t xml:space="preserve"> </w:t>
+      </w:r>
+      <w:r>
+        <w:rPr>
+          <w:i/>
+          <w:iCs/>
+        </w:rPr>
+        <w:t xml:space="preserve">98</w:t>
+      </w:r>
+      <w:r>
+        <w:t xml:space="preserve">(1), 62–72.</w:t>
+      </w:r>
+      <w:r>
+        <w:t xml:space="preserve"> </w:t>
+      </w:r>
+      <w:hyperlink r:id="rId143">
+        <w:r>
+          <w:rPr>
+            <w:rStyle w:val="Hyperlink"/>
+          </w:rPr>
+          <w:t xml:space="preserve">https://doi.org/10.1139/cjz-2019-0089</w:t>
+        </w:r>
+      </w:hyperlink>
+    </w:p>
+    <w:bookmarkEnd w:id="144"/>
+    <w:bookmarkStart w:id="146" w:name="ref-Wood2020b"/>
+    <w:p>
+      <w:pPr>
+        <w:pStyle w:val="Bibliography"/>
+      </w:pPr>
+      <w:r>
+        <w:t xml:space="preserve">Wood, T. C., &amp; Moore, P. A. (2020b). Fine-tuned responses to chemical landscapes: Crayfish use predator odors to assess threats based on relative size ratios.</w:t>
+      </w:r>
+      <w:r>
+        <w:t xml:space="preserve"> </w:t>
+      </w:r>
+      <w:r>
+        <w:rPr>
+          <w:i/>
+          <w:iCs/>
+        </w:rPr>
+        <w:t xml:space="preserve">Ecosphere</w:t>
+      </w:r>
+      <w:r>
+        <w:t xml:space="preserve">,</w:t>
+      </w:r>
+      <w:r>
+        <w:t xml:space="preserve"> </w:t>
+      </w:r>
+      <w:r>
+        <w:rPr>
+          <w:i/>
+          <w:iCs/>
+        </w:rPr>
+        <w:t xml:space="preserve">11</w:t>
+      </w:r>
+      <w:r>
+        <w:t xml:space="preserve">(9), e03188.</w:t>
+      </w:r>
+      <w:r>
+        <w:t xml:space="preserve"> </w:t>
+      </w:r>
+      <w:hyperlink r:id="rId145">
+        <w:r>
+          <w:rPr>
+            <w:rStyle w:val="Hyperlink"/>
+          </w:rPr>
+          <w:t xml:space="preserve">https://doi.org/10.1002/ecs2.3188</w:t>
+        </w:r>
+      </w:hyperlink>
+    </w:p>
+    <w:bookmarkEnd w:id="146"/>
+    <w:bookmarkStart w:id="148" w:name="ref-Wright2010"/>
+    <w:p>
+      <w:pPr>
+        <w:pStyle w:val="Bibliography"/>
+      </w:pPr>
+      <w:r>
+        <w:t xml:space="preserve">Wright, T. F., Eberhard, J. R., Hobson, E. A., Avery, M. L., &amp; Russello, M. A. (2010). Behavioral flexibility and species invasions: The adaptive flexibility hypothesis.</w:t>
+      </w:r>
+      <w:r>
+        <w:t xml:space="preserve"> </w:t>
+      </w:r>
+      <w:r>
+        <w:rPr>
+          <w:i/>
+          <w:iCs/>
+        </w:rPr>
+        <w:t xml:space="preserve">Ethology Ecology &amp; Evolution</w:t>
+      </w:r>
+      <w:r>
+        <w:t xml:space="preserve">,</w:t>
+      </w:r>
+      <w:r>
+        <w:t xml:space="preserve"> </w:t>
+      </w:r>
+      <w:r>
+        <w:rPr>
+          <w:i/>
+          <w:iCs/>
+        </w:rPr>
+        <w:t xml:space="preserve">22</w:t>
+      </w:r>
+      <w:r>
+        <w:t xml:space="preserve">(4), 393–404.</w:t>
+      </w:r>
+      <w:r>
+        <w:t xml:space="preserve"> </w:t>
+      </w:r>
+      <w:hyperlink r:id="rId147">
+        <w:r>
+          <w:rPr>
+            <w:rStyle w:val="Hyperlink"/>
+          </w:rPr>
+          <w:t xml:space="preserve">https://doi.org/10.1080/03949370.2010.505580</w:t>
+        </w:r>
+      </w:hyperlink>
+    </w:p>
+    <w:bookmarkEnd w:id="148"/>
+    <w:bookmarkStart w:id="150" w:name="ref-Zhao2024"/>
+    <w:p>
+      <w:pPr>
+        <w:pStyle w:val="Bibliography"/>
+      </w:pPr>
+      <w:r>
+        <w:t xml:space="preserve">Zhao, M., Feng, G., Wang, H., Shen, C., Fu, Y., Zhang, Y., Zhang, H., Yao, Y., Chen, J., &amp; Xu, W. (2024). The influence of shelter type and coverage on crayfish (procambarus clarkii) predation by catfish (silurus asotus): A controlled environment study.</w:t>
+      </w:r>
+      <w:r>
+        <w:t xml:space="preserve"> </w:t>
+      </w:r>
+      <w:r>
+        <w:rPr>
+          <w:i/>
+          <w:iCs/>
+        </w:rPr>
+        <w:t xml:space="preserve">Animals</w:t>
+      </w:r>
+      <w:r>
+        <w:t xml:space="preserve">,</w:t>
+      </w:r>
+      <w:r>
+        <w:t xml:space="preserve"> </w:t>
+      </w:r>
+      <w:r>
+        <w:rPr>
+          <w:i/>
+          <w:iCs/>
+        </w:rPr>
+        <w:t xml:space="preserve">14</w:t>
+      </w:r>
+      <w:r>
+        <w:t xml:space="preserve">(8), 1147.</w:t>
+      </w:r>
+      <w:r>
+        <w:t xml:space="preserve"> </w:t>
+      </w:r>
+      <w:hyperlink r:id="rId149">
+        <w:r>
+          <w:rPr>
+            <w:rStyle w:val="Hyperlink"/>
+          </w:rPr>
+          <w:t xml:space="preserve">https://doi.org/10.3390/ani14081147</w:t>
+        </w:r>
+      </w:hyperlink>
+    </w:p>
+    <w:bookmarkEnd w:id="150"/>
+    <w:bookmarkEnd w:id="151"/>
+    <w:bookmarkEnd w:id="152"/>
     <w:sectPr>
       <w:pgSz w:h="16838" w:w="11906"/>
       <w:pgMar w:bottom="1440" w:footer="708" w:gutter="0" w:header="708" w:left="1440" w:right="1440" w:top="1440"/>

</xml_diff>

<commit_message>
try again now correct render
</commit_message>
<xml_diff>
--- a/docs/index.docx
+++ b/docs/index.docx
@@ -823,7 +823,7 @@
         <w:pStyle w:val="BodyText"/>
       </w:pPr>
       <w:r>
-        <w:t xml:space="preserve">For all treatments individual kōura were highly variable in their movement around tanks and use of refuges, even in the time intervals comprising the first 60 minutes of the experiment, before fish were introduced. The coefficient of variations (CVs) for kōura refuge use in the light and the dark before fish introduction were similarly high, being 60.4 % and 58.2 % (both n = 32) respectively, confirming high baseline variation in kōura refuge use, regardless of treatment type. Despite this inherent variation in individual kōura behaviour, clear patterns in kōura refuge use were evident over the course of the experiment. Under light conditions, the control showed the largest overall increase in refuge use (4040% to 8282%), driven primarily by a sharp rise in the ‘after’ period, while the catfish treatment showed a more sustained increase across all periods (5252% to 7373%) and the eel treatment the smallest increase (3535% to 5353%</w:t>
+        <w:t xml:space="preserve">For all treatments individual kōura were highly variable in their movement around tanks and use of refuges, even in the time intervals comprising the first 60 minutes of the experiment, before fish were introduced. The coefficient of variations (CVs) for kōura refuge use in the light and the dark before fish introduction were similarly high, being 60.4 % and 58.2 % (both n = 32) respectively, confirming high baseline variation in kōura refuge use, regardless of treatment type. Despite this inherent variation in individual kōura behaviour, clear patterns in kōura refuge use were evident over the course of the experiment. Under light conditions, the control showed the largest overall increase in refuge use (40% to 82%), driven primarily by a sharp rise in the ‘after’ period, while the catfish treatment showed a more sustained increase across all periods (52% to 73%) and the eel treatment the smallest increase (35% to 53%</w:t>
       </w:r>
       <w:r>
         <w:t xml:space="preserve"> </w:t>
@@ -837,7 +837,7 @@
         </w:r>
       </w:hyperlink>
       <w:r>
-        <w:t xml:space="preserve">). Under dark conditions, the pattern shifted, with the catfish treatment showing the greatest increase (3939% to 7070%), while the eel treatment showed a modest and non-sustained increase (2727% to 4141% during exposure, returning to 3636% after), and the control remained comparatively low throughout (3737% to 4747%).</w:t>
+        <w:t xml:space="preserve">). Under dark conditions, the pattern shifted, with the catfish treatment showing the greatest increase (39% to 70%), while the eel treatment showed a modest and non-sustained increase (27% to 41% during exposure, returning to 36% after), and the control remained comparatively low throughout (37% to 47%).</w:t>
       </w:r>
     </w:p>
     <w:bookmarkEnd w:id="14"/>

</xml_diff>